<commit_message>
resume: sync dist/ variants with CGGT update (were stale — only out/ + site PDF had it)
build.mjs writes to gitignored out/; the tracked/on-GitHub copies live in
dist/ and hadn't been refreshed. Regenerate + copy all 5 variants (docx+pdf)
into dist/ so GitHub shows the CGGT master's line + one-page fit. Site PDF
re-synced from the fresh Engineer variant.

Co-Authored-By: Claude Opus 4.8 <noreply@anthropic.com>
</commit_message>
<xml_diff>
--- a/apps/resume/dist/Brian_Lee_Resume_AI.docx
+++ b/apps/resume/dist/Brian_Lee_Resume_AI.docx
@@ -4,7 +4,7 @@
   <w:body>
     <w:p>
       <w:pPr>
-        <w:spacing w:before="0" w:after="20" w:line="220" w:lineRule="auto"/>
+        <w:spacing w:before="0" w:after="20" w:line="214" w:lineRule="auto"/>
         <w:jc w:val="center"/>
       </w:pPr>
       <w:r>
@@ -20,7 +20,7 @@
     </w:p>
     <w:p>
       <w:pPr>
-        <w:spacing w:before="0" w:after="40" w:line="220" w:lineRule="auto"/>
+        <w:spacing w:before="0" w:after="40" w:line="214" w:lineRule="auto"/>
         <w:jc w:val="center"/>
       </w:pPr>
       <w:r>
@@ -69,7 +69,7 @@
         <w:pBdr>
           <w:bottom w:val="single" w:sz="6" w:space="1" w:color="000000"/>
         </w:pBdr>
-        <w:spacing w:before="80" w:after="40" w:line="220" w:lineRule="auto"/>
+        <w:spacing w:before="80" w:after="40" w:line="214" w:lineRule="auto"/>
       </w:pPr>
       <w:r>
         <w:rPr>
@@ -89,7 +89,7 @@
         <w:tabs>
           <w:tab w:val="right" w:pos="10944"/>
         </w:tabs>
-        <w:spacing w:before="40" w:after="0" w:line="220" w:lineRule="auto"/>
+        <w:spacing w:before="40" w:after="0" w:line="214" w:lineRule="auto"/>
       </w:pPr>
       <w:r>
         <w:rPr>
@@ -116,7 +116,7 @@
         <w:tabs>
           <w:tab w:val="right" w:pos="10944"/>
         </w:tabs>
-        <w:spacing w:before="0" w:after="0" w:line="220" w:lineRule="auto"/>
+        <w:spacing w:before="0" w:after="0" w:line="214" w:lineRule="auto"/>
       </w:pPr>
       <w:r>
         <w:rPr>
@@ -126,7 +126,7 @@
           <w:sz w:val="20"/>
           <w:szCs w:val="20"/>
         </w:rPr>
-        <w:t xml:space="preserve">BA in Computer Science &amp; Design (Double Major), Benjamin Franklin Scholars</w:t>
+        <w:t xml:space="preserve">MSE in Computer Graphics &amp; Game Technology (CGGT), Submatriculation</w:t>
       </w:r>
       <w:r>
         <w:rPr>
@@ -137,12 +137,41 @@
           <w:szCs w:val="20"/>
         </w:rPr>
         <w:tab/>
+        <w:t xml:space="preserve">Expected May 2028</w:t>
+      </w:r>
+    </w:p>
+    <w:p>
+      <w:pPr>
+        <w:tabs>
+          <w:tab w:val="right" w:pos="10944"/>
+        </w:tabs>
+        <w:spacing w:before="0" w:after="0" w:line="214" w:lineRule="auto"/>
+      </w:pPr>
+      <w:r>
+        <w:rPr>
+          <w:rFonts w:ascii="Calibri" w:hAnsi="Calibri" w:cs="Calibri"/>
+          <w:i/>
+          <w:iCs/>
+          <w:sz w:val="20"/>
+          <w:szCs w:val="20"/>
+        </w:rPr>
+        <w:t xml:space="preserve">BA in Computer Science &amp; Design (Double Major), Benjamin Franklin Scholars</w:t>
+      </w:r>
+      <w:r>
+        <w:rPr>
+          <w:rFonts w:ascii="Calibri" w:hAnsi="Calibri" w:cs="Calibri"/>
+          <w:i/>
+          <w:iCs/>
+          <w:sz w:val="20"/>
+          <w:szCs w:val="20"/>
+        </w:rPr>
+        <w:tab/>
         <w:t xml:space="preserve">Expected May 2027</w:t>
       </w:r>
     </w:p>
     <w:p>
       <w:pPr>
-        <w:spacing w:before="0" w:after="0" w:line="220" w:lineRule="auto"/>
+        <w:spacing w:before="0" w:after="0" w:line="214" w:lineRule="auto"/>
       </w:pPr>
       <w:r>
         <w:rPr>
@@ -168,7 +197,7 @@
         <w:pBdr>
           <w:bottom w:val="single" w:sz="6" w:space="1" w:color="000000"/>
         </w:pBdr>
-        <w:spacing w:before="60" w:after="40" w:line="220" w:lineRule="auto"/>
+        <w:spacing w:before="60" w:after="40" w:line="214" w:lineRule="auto"/>
       </w:pPr>
       <w:r>
         <w:rPr>
@@ -188,7 +217,7 @@
         <w:tabs>
           <w:tab w:val="right" w:pos="10944"/>
         </w:tabs>
-        <w:spacing w:before="100" w:after="0" w:line="220" w:lineRule="auto"/>
+        <w:spacing w:before="100" w:after="0" w:line="214" w:lineRule="auto"/>
       </w:pPr>
       <w:r>
         <w:rPr>
@@ -226,7 +255,7 @@
           <w:ilvl w:val="0"/>
           <w:numId w:val="1"/>
         </w:numPr>
-        <w:spacing w:before="0" w:after="0" w:line="220" w:lineRule="auto"/>
+        <w:spacing w:before="0" w:after="0" w:line="214" w:lineRule="auto"/>
         <w:ind w:left="360" w:hanging="216"/>
       </w:pPr>
       <w:r>
@@ -262,7 +291,7 @@
           <w:ilvl w:val="0"/>
           <w:numId w:val="1"/>
         </w:numPr>
-        <w:spacing w:before="0" w:after="0" w:line="220" w:lineRule="auto"/>
+        <w:spacing w:before="0" w:after="0" w:line="214" w:lineRule="auto"/>
         <w:ind w:left="360" w:hanging="216"/>
       </w:pPr>
       <w:r>
@@ -298,7 +327,7 @@
           <w:ilvl w:val="0"/>
           <w:numId w:val="1"/>
         </w:numPr>
-        <w:spacing w:before="0" w:after="0" w:line="220" w:lineRule="auto"/>
+        <w:spacing w:before="0" w:after="0" w:line="214" w:lineRule="auto"/>
         <w:ind w:left="360" w:hanging="216"/>
       </w:pPr>
       <w:r>
@@ -334,7 +363,7 @@
           <w:ilvl w:val="0"/>
           <w:numId w:val="1"/>
         </w:numPr>
-        <w:spacing w:before="0" w:after="0" w:line="220" w:lineRule="auto"/>
+        <w:spacing w:before="0" w:after="0" w:line="214" w:lineRule="auto"/>
         <w:ind w:left="360" w:hanging="216"/>
       </w:pPr>
       <w:r>
@@ -369,7 +398,7 @@
         <w:tabs>
           <w:tab w:val="right" w:pos="10944"/>
         </w:tabs>
-        <w:spacing w:before="100" w:after="0" w:line="220" w:lineRule="auto"/>
+        <w:spacing w:before="100" w:after="0" w:line="214" w:lineRule="auto"/>
       </w:pPr>
       <w:r>
         <w:rPr>
@@ -407,7 +436,7 @@
           <w:ilvl w:val="0"/>
           <w:numId w:val="1"/>
         </w:numPr>
-        <w:spacing w:before="0" w:after="0" w:line="220" w:lineRule="auto"/>
+        <w:spacing w:before="0" w:after="0" w:line="214" w:lineRule="auto"/>
         <w:ind w:left="360" w:hanging="216"/>
       </w:pPr>
       <w:r>
@@ -443,7 +472,7 @@
           <w:ilvl w:val="0"/>
           <w:numId w:val="1"/>
         </w:numPr>
-        <w:spacing w:before="0" w:after="0" w:line="220" w:lineRule="auto"/>
+        <w:spacing w:before="0" w:after="0" w:line="214" w:lineRule="auto"/>
         <w:ind w:left="360" w:hanging="216"/>
       </w:pPr>
       <w:r>
@@ -479,7 +508,7 @@
           <w:ilvl w:val="0"/>
           <w:numId w:val="1"/>
         </w:numPr>
-        <w:spacing w:before="0" w:after="0" w:line="220" w:lineRule="auto"/>
+        <w:spacing w:before="0" w:after="0" w:line="214" w:lineRule="auto"/>
         <w:ind w:left="360" w:hanging="216"/>
       </w:pPr>
       <w:r>
@@ -514,7 +543,7 @@
         <w:tabs>
           <w:tab w:val="right" w:pos="10944"/>
         </w:tabs>
-        <w:spacing w:before="100" w:after="0" w:line="220" w:lineRule="auto"/>
+        <w:spacing w:before="100" w:after="0" w:line="214" w:lineRule="auto"/>
       </w:pPr>
       <w:r>
         <w:rPr>
@@ -552,7 +581,7 @@
           <w:ilvl w:val="0"/>
           <w:numId w:val="1"/>
         </w:numPr>
-        <w:spacing w:before="0" w:after="0" w:line="220" w:lineRule="auto"/>
+        <w:spacing w:before="0" w:after="0" w:line="214" w:lineRule="auto"/>
         <w:ind w:left="360" w:hanging="216"/>
       </w:pPr>
       <w:r>
@@ -598,7 +627,7 @@
           <w:ilvl w:val="0"/>
           <w:numId w:val="1"/>
         </w:numPr>
-        <w:spacing w:before="0" w:after="0" w:line="220" w:lineRule="auto"/>
+        <w:spacing w:before="0" w:after="0" w:line="214" w:lineRule="auto"/>
         <w:ind w:left="360" w:hanging="216"/>
       </w:pPr>
       <w:r>
@@ -634,7 +663,7 @@
           <w:ilvl w:val="0"/>
           <w:numId w:val="1"/>
         </w:numPr>
-        <w:spacing w:before="0" w:after="0" w:line="220" w:lineRule="auto"/>
+        <w:spacing w:before="0" w:after="0" w:line="214" w:lineRule="auto"/>
         <w:ind w:left="360" w:hanging="216"/>
       </w:pPr>
       <w:r>
@@ -669,7 +698,7 @@
         <w:tabs>
           <w:tab w:val="right" w:pos="10944"/>
         </w:tabs>
-        <w:spacing w:before="100" w:after="0" w:line="220" w:lineRule="auto"/>
+        <w:spacing w:before="100" w:after="0" w:line="214" w:lineRule="auto"/>
       </w:pPr>
       <w:r>
         <w:rPr>
@@ -707,7 +736,7 @@
           <w:ilvl w:val="0"/>
           <w:numId w:val="1"/>
         </w:numPr>
-        <w:spacing w:before="0" w:after="0" w:line="220" w:lineRule="auto"/>
+        <w:spacing w:before="0" w:after="0" w:line="214" w:lineRule="auto"/>
         <w:ind w:left="360" w:hanging="216"/>
       </w:pPr>
       <w:r>
@@ -743,7 +772,7 @@
           <w:ilvl w:val="0"/>
           <w:numId w:val="1"/>
         </w:numPr>
-        <w:spacing w:before="0" w:after="0" w:line="220" w:lineRule="auto"/>
+        <w:spacing w:before="0" w:after="0" w:line="214" w:lineRule="auto"/>
         <w:ind w:left="360" w:hanging="216"/>
       </w:pPr>
       <w:r>
@@ -778,7 +807,7 @@
         <w:tabs>
           <w:tab w:val="right" w:pos="10944"/>
         </w:tabs>
-        <w:spacing w:before="100" w:after="0" w:line="220" w:lineRule="auto"/>
+        <w:spacing w:before="100" w:after="0" w:line="214" w:lineRule="auto"/>
       </w:pPr>
       <w:r>
         <w:rPr>
@@ -816,7 +845,7 @@
           <w:ilvl w:val="0"/>
           <w:numId w:val="1"/>
         </w:numPr>
-        <w:spacing w:before="0" w:after="0" w:line="220" w:lineRule="auto"/>
+        <w:spacing w:before="0" w:after="0" w:line="214" w:lineRule="auto"/>
         <w:ind w:left="360" w:hanging="216"/>
       </w:pPr>
       <w:r>
@@ -852,7 +881,7 @@
           <w:ilvl w:val="0"/>
           <w:numId w:val="1"/>
         </w:numPr>
-        <w:spacing w:before="0" w:after="0" w:line="220" w:lineRule="auto"/>
+        <w:spacing w:before="0" w:after="0" w:line="214" w:lineRule="auto"/>
         <w:ind w:left="360" w:hanging="216"/>
       </w:pPr>
       <w:r>
@@ -888,7 +917,7 @@
           <w:ilvl w:val="0"/>
           <w:numId w:val="1"/>
         </w:numPr>
-        <w:spacing w:before="0" w:after="0" w:line="220" w:lineRule="auto"/>
+        <w:spacing w:before="0" w:after="0" w:line="214" w:lineRule="auto"/>
         <w:ind w:left="360" w:hanging="216"/>
       </w:pPr>
       <w:r>
@@ -923,7 +952,7 @@
         <w:pBdr>
           <w:bottom w:val="single" w:sz="6" w:space="1" w:color="000000"/>
         </w:pBdr>
-        <w:spacing w:before="60" w:after="40" w:line="220" w:lineRule="auto"/>
+        <w:spacing w:before="60" w:after="40" w:line="214" w:lineRule="auto"/>
       </w:pPr>
       <w:r>
         <w:rPr>
@@ -943,7 +972,7 @@
         <w:tabs>
           <w:tab w:val="right" w:pos="10944"/>
         </w:tabs>
-        <w:spacing w:before="60" w:after="0" w:line="220" w:lineRule="auto"/>
+        <w:spacing w:before="60" w:after="0" w:line="214" w:lineRule="auto"/>
       </w:pPr>
       <w:r>
         <w:rPr>
@@ -991,7 +1020,7 @@
           <w:ilvl w:val="0"/>
           <w:numId w:val="1"/>
         </w:numPr>
-        <w:spacing w:before="0" w:after="0" w:line="220" w:lineRule="auto"/>
+        <w:spacing w:before="0" w:after="0" w:line="214" w:lineRule="auto"/>
         <w:ind w:left="360" w:hanging="216"/>
       </w:pPr>
       <w:r>
@@ -1045,7 +1074,7 @@
           <w:ilvl w:val="0"/>
           <w:numId w:val="1"/>
         </w:numPr>
-        <w:spacing w:before="0" w:after="0" w:line="220" w:lineRule="auto"/>
+        <w:spacing w:before="0" w:after="0" w:line="214" w:lineRule="auto"/>
         <w:ind w:left="360" w:hanging="216"/>
       </w:pPr>
       <w:r>
@@ -1081,7 +1110,7 @@
           <w:ilvl w:val="0"/>
           <w:numId w:val="1"/>
         </w:numPr>
-        <w:spacing w:before="0" w:after="0" w:line="220" w:lineRule="auto"/>
+        <w:spacing w:before="0" w:after="0" w:line="214" w:lineRule="auto"/>
         <w:ind w:left="360" w:hanging="216"/>
       </w:pPr>
       <w:r>
@@ -1116,7 +1145,7 @@
         <w:tabs>
           <w:tab w:val="right" w:pos="10944"/>
         </w:tabs>
-        <w:spacing w:before="60" w:after="0" w:line="220" w:lineRule="auto"/>
+        <w:spacing w:before="60" w:after="0" w:line="214" w:lineRule="auto"/>
       </w:pPr>
       <w:r>
         <w:rPr>
@@ -1164,7 +1193,7 @@
           <w:ilvl w:val="0"/>
           <w:numId w:val="1"/>
         </w:numPr>
-        <w:spacing w:before="0" w:after="0" w:line="220" w:lineRule="auto"/>
+        <w:spacing w:before="0" w:after="0" w:line="214" w:lineRule="auto"/>
         <w:ind w:left="360" w:hanging="216"/>
       </w:pPr>
       <w:r>
@@ -1200,7 +1229,7 @@
           <w:ilvl w:val="0"/>
           <w:numId w:val="1"/>
         </w:numPr>
-        <w:spacing w:before="0" w:after="0" w:line="220" w:lineRule="auto"/>
+        <w:spacing w:before="0" w:after="0" w:line="214" w:lineRule="auto"/>
         <w:ind w:left="360" w:hanging="216"/>
       </w:pPr>
       <w:r>
@@ -1236,7 +1265,7 @@
           <w:ilvl w:val="0"/>
           <w:numId w:val="1"/>
         </w:numPr>
-        <w:spacing w:before="0" w:after="0" w:line="220" w:lineRule="auto"/>
+        <w:spacing w:before="0" w:after="0" w:line="214" w:lineRule="auto"/>
         <w:ind w:left="360" w:hanging="216"/>
       </w:pPr>
       <w:r>
@@ -1271,7 +1300,7 @@
         <w:tabs>
           <w:tab w:val="right" w:pos="10944"/>
         </w:tabs>
-        <w:spacing w:before="60" w:after="0" w:line="220" w:lineRule="auto"/>
+        <w:spacing w:before="60" w:after="0" w:line="214" w:lineRule="auto"/>
       </w:pPr>
       <w:r>
         <w:rPr>
@@ -1319,7 +1348,7 @@
           <w:ilvl w:val="0"/>
           <w:numId w:val="1"/>
         </w:numPr>
-        <w:spacing w:before="0" w:after="0" w:line="220" w:lineRule="auto"/>
+        <w:spacing w:before="0" w:after="0" w:line="214" w:lineRule="auto"/>
         <w:ind w:left="360" w:hanging="216"/>
       </w:pPr>
       <w:r>
@@ -1355,7 +1384,7 @@
           <w:ilvl w:val="0"/>
           <w:numId w:val="1"/>
         </w:numPr>
-        <w:spacing w:before="0" w:after="0" w:line="220" w:lineRule="auto"/>
+        <w:spacing w:before="0" w:after="0" w:line="214" w:lineRule="auto"/>
         <w:ind w:left="360" w:hanging="216"/>
       </w:pPr>
       <w:r>
@@ -1391,7 +1420,7 @@
           <w:ilvl w:val="0"/>
           <w:numId w:val="1"/>
         </w:numPr>
-        <w:spacing w:before="0" w:after="0" w:line="220" w:lineRule="auto"/>
+        <w:spacing w:before="0" w:after="0" w:line="214" w:lineRule="auto"/>
         <w:ind w:left="360" w:hanging="216"/>
       </w:pPr>
       <w:r>
@@ -1444,7 +1473,7 @@
         <w:pBdr>
           <w:bottom w:val="single" w:sz="6" w:space="1" w:color="000000"/>
         </w:pBdr>
-        <w:spacing w:before="60" w:after="40" w:line="220" w:lineRule="auto"/>
+        <w:spacing w:before="60" w:after="40" w:line="214" w:lineRule="auto"/>
       </w:pPr>
       <w:r>
         <w:rPr>
@@ -1461,7 +1490,7 @@
     </w:p>
     <w:p>
       <w:pPr>
-        <w:spacing w:before="40" w:after="0" w:line="220" w:lineRule="auto"/>
+        <w:spacing w:before="40" w:after="0" w:line="214" w:lineRule="auto"/>
       </w:pPr>
       <w:r>
         <w:rPr>
@@ -1484,7 +1513,7 @@
     </w:p>
     <w:p>
       <w:pPr>
-        <w:spacing w:before="0" w:after="0" w:line="220" w:lineRule="auto"/>
+        <w:spacing w:before="0" w:after="0" w:line="214" w:lineRule="auto"/>
       </w:pPr>
       <w:r>
         <w:rPr>
@@ -1507,7 +1536,7 @@
     </w:p>
     <w:p>
       <w:pPr>
-        <w:spacing w:before="0" w:after="0" w:line="220" w:lineRule="auto"/>
+        <w:spacing w:before="0" w:after="0" w:line="214" w:lineRule="auto"/>
       </w:pPr>
       <w:r>
         <w:rPr>

</xml_diff>

<commit_message>
resume: Engineer → general-SWE T-shape; refresh Aleph across all variants
Engineer variant reframed to read as a general software engineer (per SWE-resume
research: breadth up top, one graphics project as systems/performance depth):
- projects now CareerOS (full-stack/data) + Capsule (full-stack) + Mini Minecraft
  reframed as engine/algorithms/performance (dropped Mini Maya from Engineer)
- graphics tools moved to a small secondary skills line
Aleph bullets refreshed from work-logs w/ impact + defensible metrics across
Engineer/Graphics/Game (installable-service SDK, 0 fix-loops, first measured
win-back → paid conversion), AI (retention-diagnosis impact), and Design
(Figma-driven mobile redesign). All 5 variants one page.

Co-Authored-By: Claude Opus 4.8 <noreply@anthropic.com>
</commit_message>
<xml_diff>
--- a/apps/resume/dist/Brian_Lee_Resume_AI.docx
+++ b/apps/resume/dist/Brian_Lee_Resume_AI.docx
@@ -264,25 +264,53 @@
           <w:sz w:val="21"/>
           <w:szCs w:val="21"/>
         </w:rPr>
-        <w:t xml:space="preserve">Architected a typed integration SDK placing a </w:t>
-      </w:r>
-      <w:r>
-        <w:rPr>
-          <w:rFonts w:ascii="Calibri" w:hAnsi="Calibri" w:cs="Calibri"/>
-          <w:b/>
-          <w:bCs/>
-          <w:sz w:val="21"/>
-          <w:szCs w:val="21"/>
-        </w:rPr>
-        <w:t xml:space="preserve">production game-AI agent</w:t>
-      </w:r>
-      <w:r>
-        <w:rPr>
-          <w:rFonts w:ascii="Calibri" w:hAnsi="Calibri" w:cs="Calibri"/>
-          <w:sz w:val="21"/>
-          <w:szCs w:val="21"/>
-        </w:rPr>
-        <w:t xml:space="preserve"> behind 4 versioned contract seams (zod, JSON Schema, 136 tests), verified against the live system at full event parity</w:t>
+        <w:t xml:space="preserve">Architected a typed integration SDK that packaged a </w:t>
+      </w:r>
+      <w:r>
+        <w:rPr>
+          <w:rFonts w:ascii="Calibri" w:hAnsi="Calibri" w:cs="Calibri"/>
+          <w:b/>
+          <w:bCs/>
+          <w:sz w:val="21"/>
+          <w:szCs w:val="21"/>
+        </w:rPr>
+        <w:t xml:space="preserve">production AI agent</w:t>
+      </w:r>
+      <w:r>
+        <w:rPr>
+          <w:rFonts w:ascii="Calibri" w:hAnsi="Calibri" w:cs="Calibri"/>
+          <w:sz w:val="21"/>
+          <w:szCs w:val="21"/>
+        </w:rPr>
+        <w:t xml:space="preserve"> as an installable service — 5 versioned wire contracts (zod, JSON Schema, </w:t>
+      </w:r>
+      <w:r>
+        <w:rPr>
+          <w:rFonts w:ascii="Calibri" w:hAnsi="Calibri" w:cs="Calibri"/>
+          <w:b/>
+          <w:bCs/>
+          <w:sz w:val="21"/>
+          <w:szCs w:val="21"/>
+        </w:rPr>
+        <w:t xml:space="preserve">136 tests</w:t>
+      </w:r>
+      <w:r>
+        <w:rPr>
+          <w:rFonts w:ascii="Calibri" w:hAnsi="Calibri" w:cs="Calibri"/>
+          <w:sz w:val="21"/>
+          <w:szCs w:val="21"/>
+        </w:rPr>
+        <w:t xml:space="preserve">); a fresh AI coding agent integrated a new environment to green in </w:t>
+      </w:r>
+      <w:r>
+        <w:rPr>
+          <w:rFonts w:ascii="Calibri" w:hAnsi="Calibri" w:cs="Calibri"/>
+          <w:b/>
+          <w:bCs/>
+          <w:sz w:val="21"/>
+          <w:szCs w:val="21"/>
+        </w:rPr>
+        <w:t xml:space="preserve">0 fix-loops</w:t>
       </w:r>
     </w:p>
     <w:p>
@@ -318,7 +346,17 @@
           <w:sz w:val="21"/>
           <w:szCs w:val="21"/>
         </w:rPr>
-        <w:t xml:space="preserve"> that mined production data via read-only MCP, surfacing an onboarding activation gap that reshaped priorities</w:t>
+        <w:t xml:space="preserve"> that mined production data via read-only MCP — diagnosed a reported retention gain as a measurement artifact and surfaced the real churn drivers, </w:t>
+      </w:r>
+      <w:r>
+        <w:rPr>
+          <w:rFonts w:ascii="Calibri" w:hAnsi="Calibri" w:cs="Calibri"/>
+          <w:b/>
+          <w:bCs/>
+          <w:sz w:val="21"/>
+          <w:szCs w:val="21"/>
+        </w:rPr>
+        <w:t xml:space="preserve">reshaping the team's roadmap</w:t>
       </w:r>
     </w:p>
     <w:p>
@@ -354,7 +392,17 @@
           <w:sz w:val="21"/>
           <w:szCs w:val="21"/>
         </w:rPr>
-        <w:t xml:space="preserve"> instrumented to measure return-rate lift</w:t>
+        <w:t xml:space="preserve">, driving the product's </w:t>
+      </w:r>
+      <w:r>
+        <w:rPr>
+          <w:rFonts w:ascii="Calibri" w:hAnsi="Calibri" w:cs="Calibri"/>
+          <w:b/>
+          <w:bCs/>
+          <w:sz w:val="21"/>
+          <w:szCs w:val="21"/>
+        </w:rPr>
+        <w:t xml:space="preserve">first measured win-back → paid conversion</w:t>
       </w:r>
     </w:p>
     <w:p>
@@ -390,7 +438,7 @@
           <w:sz w:val="21"/>
           <w:szCs w:val="21"/>
         </w:rPr>
-        <w:t xml:space="preserve"> — agent orchestration, MCP tool integration, and config-driven AI game modes — at a 4-engineer YC startup</w:t>
+        <w:t xml:space="preserve"> — agent orchestration, MCP tool integration, and config-driven AI modes — at a 4-engineer YC startup</w:t>
       </w:r>
     </w:p>
     <w:p>

</xml_diff>

<commit_message>
resume: rename Engineer→SWE, drop CareerOS, clearer Aleph + meaningful bold
- rename the general variant Engineer → SWE (Brian_Lee_Resume_SWE.pdf); site
  now serves it. Removed the obsolete Engineer dist files.
- took CareerOS off every variant (SWE = Capsule + Mini Minecraft engine +
  Mini Maya mesh algorithms — SWE-first, graphics as the 'cherry')
- rewrote the Aleph Lab bullets to actually explain the work + impact in plain
  terms (drop-in AI-agent package, retention win-back → first recovered paid
  subscription, 401→200 outage fix)
- trimmed **bold** to only meaningful proof points (metrics/outcomes), unbolded
  generic phrases; fixed the '15+-person' typo → 'team of 15+'

Co-Authored-By: Claude Opus 4.8 <noreply@anthropic.com>
</commit_message>
<xml_diff>
--- a/apps/resume/dist/Brian_Lee_Resume_AI.docx
+++ b/apps/resume/dist/Brian_Lee_Resume_AI.docx
@@ -264,70 +264,6 @@
           <w:sz w:val="21"/>
           <w:szCs w:val="21"/>
         </w:rPr>
-        <w:t xml:space="preserve">Architected a typed integration SDK that packaged a </w:t>
-      </w:r>
-      <w:r>
-        <w:rPr>
-          <w:rFonts w:ascii="Calibri" w:hAnsi="Calibri" w:cs="Calibri"/>
-          <w:b/>
-          <w:bCs/>
-          <w:sz w:val="21"/>
-          <w:szCs w:val="21"/>
-        </w:rPr>
-        <w:t xml:space="preserve">production AI agent</w:t>
-      </w:r>
-      <w:r>
-        <w:rPr>
-          <w:rFonts w:ascii="Calibri" w:hAnsi="Calibri" w:cs="Calibri"/>
-          <w:sz w:val="21"/>
-          <w:szCs w:val="21"/>
-        </w:rPr>
-        <w:t xml:space="preserve"> as an installable service — 5 versioned wire contracts (zod, JSON Schema, </w:t>
-      </w:r>
-      <w:r>
-        <w:rPr>
-          <w:rFonts w:ascii="Calibri" w:hAnsi="Calibri" w:cs="Calibri"/>
-          <w:b/>
-          <w:bCs/>
-          <w:sz w:val="21"/>
-          <w:szCs w:val="21"/>
-        </w:rPr>
-        <w:t xml:space="preserve">136 tests</w:t>
-      </w:r>
-      <w:r>
-        <w:rPr>
-          <w:rFonts w:ascii="Calibri" w:hAnsi="Calibri" w:cs="Calibri"/>
-          <w:sz w:val="21"/>
-          <w:szCs w:val="21"/>
-        </w:rPr>
-        <w:t xml:space="preserve">); a fresh AI coding agent integrated a new environment to green in </w:t>
-      </w:r>
-      <w:r>
-        <w:rPr>
-          <w:rFonts w:ascii="Calibri" w:hAnsi="Calibri" w:cs="Calibri"/>
-          <w:b/>
-          <w:bCs/>
-          <w:sz w:val="21"/>
-          <w:szCs w:val="21"/>
-        </w:rPr>
-        <w:t xml:space="preserve">0 fix-loops</w:t>
-      </w:r>
-    </w:p>
-    <w:p>
-      <w:pPr>
-        <w:numPr>
-          <w:ilvl w:val="0"/>
-          <w:numId w:val="1"/>
-        </w:numPr>
-        <w:spacing w:before="0" w:after="0" w:line="214" w:lineRule="auto"/>
-        <w:ind w:left="360" w:hanging="216"/>
-      </w:pPr>
-      <w:r>
-        <w:rPr>
-          <w:rFonts w:ascii="Calibri" w:hAnsi="Calibri" w:cs="Calibri"/>
-          <w:sz w:val="21"/>
-          <w:szCs w:val="21"/>
-        </w:rPr>
         <w:t xml:space="preserve">Built a </w:t>
       </w:r>
       <w:r>
@@ -346,7 +282,7 @@
           <w:sz w:val="21"/>
           <w:szCs w:val="21"/>
         </w:rPr>
-        <w:t xml:space="preserve"> that mined production data via read-only MCP — diagnosed a reported retention gain as a measurement artifact and surfaced the real churn drivers, </w:t>
+        <w:t xml:space="preserve"> that mines production data through read-only MCP — used it to show a reported retention gain was a measurement artifact and surface the real churn drivers, </w:t>
       </w:r>
       <w:r>
         <w:rPr>
@@ -374,53 +310,81 @@
           <w:sz w:val="21"/>
           <w:szCs w:val="21"/>
         </w:rPr>
-        <w:t xml:space="preserve">Shipped to production a recency-segmented retention engine (Supabase, Deno, FCM) with a </w:t>
-      </w:r>
-      <w:r>
-        <w:rPr>
-          <w:rFonts w:ascii="Calibri" w:hAnsi="Calibri" w:cs="Calibri"/>
-          <w:b/>
-          <w:bCs/>
-          <w:sz w:val="21"/>
-          <w:szCs w:val="21"/>
-        </w:rPr>
-        <w:t xml:space="preserve">treatment/holdout A/B</w:t>
-      </w:r>
-      <w:r>
-        <w:rPr>
-          <w:rFonts w:ascii="Calibri" w:hAnsi="Calibri" w:cs="Calibri"/>
-          <w:sz w:val="21"/>
-          <w:szCs w:val="21"/>
-        </w:rPr>
-        <w:t xml:space="preserve">, driving the product's </w:t>
-      </w:r>
-      <w:r>
-        <w:rPr>
-          <w:rFonts w:ascii="Calibri" w:hAnsi="Calibri" w:cs="Calibri"/>
-          <w:b/>
-          <w:bCs/>
-          <w:sz w:val="21"/>
-          <w:szCs w:val="21"/>
-        </w:rPr>
-        <w:t xml:space="preserve">first measured win-back → paid conversion</w:t>
-      </w:r>
-    </w:p>
-    <w:p>
-      <w:pPr>
-        <w:numPr>
-          <w:ilvl w:val="0"/>
-          <w:numId w:val="1"/>
-        </w:numPr>
-        <w:spacing w:before="0" w:after="0" w:line="214" w:lineRule="auto"/>
-        <w:ind w:left="360" w:hanging="216"/>
-      </w:pPr>
-      <w:r>
-        <w:rPr>
-          <w:rFonts w:ascii="Calibri" w:hAnsi="Calibri" w:cs="Calibri"/>
-          <w:sz w:val="21"/>
-          <w:szCs w:val="21"/>
-        </w:rPr>
-        <w:t xml:space="preserve">Worked across the </w:t>
+        <w:t xml:space="preserve">Turned the company's production AI agent into a drop-in package other teams can embed in their own apps — a typed SDK with versioned APIs and </w:t>
+      </w:r>
+      <w:r>
+        <w:rPr>
+          <w:rFonts w:ascii="Calibri" w:hAnsi="Calibri" w:cs="Calibri"/>
+          <w:b/>
+          <w:bCs/>
+          <w:sz w:val="21"/>
+          <w:szCs w:val="21"/>
+        </w:rPr>
+        <w:t xml:space="preserve">136 automated tests</w:t>
+      </w:r>
+      <w:r>
+        <w:rPr>
+          <w:rFonts w:ascii="Calibri" w:hAnsi="Calibri" w:cs="Calibri"/>
+          <w:sz w:val="21"/>
+          <w:szCs w:val="21"/>
+        </w:rPr>
+        <w:t xml:space="preserve">; a new AI coding agent integrated it on the </w:t>
+      </w:r>
+      <w:r>
+        <w:rPr>
+          <w:rFonts w:ascii="Calibri" w:hAnsi="Calibri" w:cs="Calibri"/>
+          <w:b/>
+          <w:bCs/>
+          <w:sz w:val="21"/>
+          <w:szCs w:val="21"/>
+        </w:rPr>
+        <w:t xml:space="preserve">first attempt</w:t>
+      </w:r>
+    </w:p>
+    <w:p>
+      <w:pPr>
+        <w:numPr>
+          <w:ilvl w:val="0"/>
+          <w:numId w:val="1"/>
+        </w:numPr>
+        <w:spacing w:before="0" w:after="0" w:line="214" w:lineRule="auto"/>
+        <w:ind w:left="360" w:hanging="216"/>
+      </w:pPr>
+      <w:r>
+        <w:rPr>
+          <w:rFonts w:ascii="Calibri" w:hAnsi="Calibri" w:cs="Calibri"/>
+          <w:sz w:val="21"/>
+          <w:szCs w:val="21"/>
+        </w:rPr>
+        <w:t xml:space="preserve">Shipped a production retention system (Supabase, Deno edge functions, FCM) with a treatment/holdout A/B that drove the product's </w:t>
+      </w:r>
+      <w:r>
+        <w:rPr>
+          <w:rFonts w:ascii="Calibri" w:hAnsi="Calibri" w:cs="Calibri"/>
+          <w:b/>
+          <w:bCs/>
+          <w:sz w:val="21"/>
+          <w:szCs w:val="21"/>
+        </w:rPr>
+        <w:t xml:space="preserve">first recovered paid subscription</w:t>
+      </w:r>
+    </w:p>
+    <w:p>
+      <w:pPr>
+        <w:numPr>
+          <w:ilvl w:val="0"/>
+          <w:numId w:val="1"/>
+        </w:numPr>
+        <w:spacing w:before="0" w:after="0" w:line="214" w:lineRule="auto"/>
+        <w:ind w:left="360" w:hanging="216"/>
+      </w:pPr>
+      <w:r>
+        <w:rPr>
+          <w:rFonts w:ascii="Calibri" w:hAnsi="Calibri" w:cs="Calibri"/>
+          <w:sz w:val="21"/>
+          <w:szCs w:val="21"/>
+        </w:rPr>
+        <w:t xml:space="preserve">Works across the full </w:t>
       </w:r>
       <w:r>
         <w:rPr>
@@ -511,7 +475,7 @@
           <w:sz w:val="21"/>
           <w:szCs w:val="21"/>
         </w:rPr>
-        <w:t xml:space="preserve">, improving UI/UX and core gameplay stability across deployments</w:t>
+        <w:t xml:space="preserve">, improving UI/UX and core gameplay stability across releases</w:t>
       </w:r>
     </w:p>
     <w:p>
@@ -565,25 +529,7 @@
           <w:sz w:val="21"/>
           <w:szCs w:val="21"/>
         </w:rPr>
-        <w:t xml:space="preserve">Upgraded SDKs and platform modules </w:t>
-      </w:r>
-      <w:r>
-        <w:rPr>
-          <w:rFonts w:ascii="Calibri" w:hAnsi="Calibri" w:cs="Calibri"/>
-          <w:b/>
-          <w:bCs/>
-          <w:sz w:val="21"/>
-          <w:szCs w:val="21"/>
-        </w:rPr>
-        <w:t xml:space="preserve">fleet-wide</w:t>
-      </w:r>
-      <w:r>
-        <w:rPr>
-          <w:rFonts w:ascii="Calibri" w:hAnsi="Calibri" w:cs="Calibri"/>
-          <w:sz w:val="21"/>
-          <w:szCs w:val="21"/>
-        </w:rPr>
-        <w:t xml:space="preserve"> to meet evolving app-store requirements and sustain production availability</w:t>
+        <w:t xml:space="preserve">Upgraded SDKs and platform modules fleet-wide to meet evolving app-store requirements and sustain production availability</w:t>
       </w:r>
     </w:p>
     <w:p>
@@ -638,25 +584,25 @@
           <w:sz w:val="21"/>
           <w:szCs w:val="21"/>
         </w:rPr>
-        <w:t xml:space="preserve">Led a </w:t>
-      </w:r>
-      <w:r>
-        <w:rPr>
-          <w:rFonts w:ascii="Calibri" w:hAnsi="Calibri" w:cs="Calibri"/>
-          <w:b/>
-          <w:bCs/>
-          <w:sz w:val="21"/>
-          <w:szCs w:val="21"/>
-        </w:rPr>
-        <w:t xml:space="preserve">15+-person cross-functional team</w:t>
-      </w:r>
-      <w:r>
-        <w:rPr>
-          <w:rFonts w:ascii="Calibri" w:hAnsi="Calibri" w:cs="Calibri"/>
-          <w:sz w:val="21"/>
-          <w:szCs w:val="21"/>
-        </w:rPr>
-        <w:t xml:space="preserve"> of designers and developers to ship client-facing </w:t>
+        <w:t xml:space="preserve">Led a cross-functional team of </w:t>
+      </w:r>
+      <w:r>
+        <w:rPr>
+          <w:rFonts w:ascii="Calibri" w:hAnsi="Calibri" w:cs="Calibri"/>
+          <w:b/>
+          <w:bCs/>
+          <w:sz w:val="21"/>
+          <w:szCs w:val="21"/>
+        </w:rPr>
+        <w:t xml:space="preserve">15+</w:t>
+      </w:r>
+      <w:r>
+        <w:rPr>
+          <w:rFonts w:ascii="Calibri" w:hAnsi="Calibri" w:cs="Calibri"/>
+          <w:sz w:val="21"/>
+          <w:szCs w:val="21"/>
+        </w:rPr>
+        <w:t xml:space="preserve"> designers and developers to ship client-facing </w:t>
       </w:r>
       <w:r>
         <w:rPr>
@@ -684,61 +630,25 @@
           <w:sz w:val="21"/>
           <w:szCs w:val="21"/>
         </w:rPr>
-        <w:t xml:space="preserve">Defined </w:t>
-      </w:r>
-      <w:r>
-        <w:rPr>
-          <w:rFonts w:ascii="Calibri" w:hAnsi="Calibri" w:cs="Calibri"/>
-          <w:b/>
-          <w:bCs/>
-          <w:sz w:val="21"/>
-          <w:szCs w:val="21"/>
-        </w:rPr>
-        <w:t xml:space="preserve">end-to-end user flows</w:t>
-      </w:r>
-      <w:r>
-        <w:rPr>
-          <w:rFonts w:ascii="Calibri" w:hAnsi="Calibri" w:cs="Calibri"/>
-          <w:sz w:val="21"/>
-          <w:szCs w:val="21"/>
-        </w:rPr>
-        <w:t xml:space="preserve">, interaction patterns, and reusable interface systems across multiple deliverables</w:t>
-      </w:r>
-    </w:p>
-    <w:p>
-      <w:pPr>
-        <w:numPr>
-          <w:ilvl w:val="0"/>
-          <w:numId w:val="1"/>
-        </w:numPr>
-        <w:spacing w:before="0" w:after="0" w:line="214" w:lineRule="auto"/>
-        <w:ind w:left="360" w:hanging="216"/>
-      </w:pPr>
-      <w:r>
-        <w:rPr>
-          <w:rFonts w:ascii="Calibri" w:hAnsi="Calibri" w:cs="Calibri"/>
-          <w:sz w:val="21"/>
-          <w:szCs w:val="21"/>
-        </w:rPr>
-        <w:t xml:space="preserve">Shipped polished, </w:t>
-      </w:r>
-      <w:r>
-        <w:rPr>
-          <w:rFonts w:ascii="Calibri" w:hAnsi="Calibri" w:cs="Calibri"/>
-          <w:b/>
-          <w:bCs/>
-          <w:sz w:val="21"/>
-          <w:szCs w:val="21"/>
-        </w:rPr>
-        <w:t xml:space="preserve">user-centered features</w:t>
-      </w:r>
-      <w:r>
-        <w:rPr>
-          <w:rFonts w:ascii="Calibri" w:hAnsi="Calibri" w:cs="Calibri"/>
-          <w:sz w:val="21"/>
-          <w:szCs w:val="21"/>
-        </w:rPr>
-        <w:t xml:space="preserve"> across semester-long client project cycles</w:t>
+        <w:t xml:space="preserve">Defined end-to-end user flows, interaction patterns, and reusable interface systems across multiple deliverables</w:t>
+      </w:r>
+    </w:p>
+    <w:p>
+      <w:pPr>
+        <w:numPr>
+          <w:ilvl w:val="0"/>
+          <w:numId w:val="1"/>
+        </w:numPr>
+        <w:spacing w:before="0" w:after="0" w:line="214" w:lineRule="auto"/>
+        <w:ind w:left="360" w:hanging="216"/>
+      </w:pPr>
+      <w:r>
+        <w:rPr>
+          <w:rFonts w:ascii="Calibri" w:hAnsi="Calibri" w:cs="Calibri"/>
+          <w:sz w:val="21"/>
+          <w:szCs w:val="21"/>
+        </w:rPr>
+        <w:t xml:space="preserve">Shipped polished, user-centered features across semester-long client project cycles</w:t>
       </w:r>
     </w:p>
     <w:p>
@@ -793,61 +703,25 @@
           <w:sz w:val="21"/>
           <w:szCs w:val="21"/>
         </w:rPr>
-        <w:t xml:space="preserve">Provided </w:t>
-      </w:r>
-      <w:r>
-        <w:rPr>
-          <w:rFonts w:ascii="Calibri" w:hAnsi="Calibri" w:cs="Calibri"/>
-          <w:b/>
-          <w:bCs/>
-          <w:sz w:val="21"/>
-          <w:szCs w:val="21"/>
-        </w:rPr>
-        <w:t xml:space="preserve">real-time English-Korean interpretation</w:t>
-      </w:r>
-      <w:r>
-        <w:rPr>
-          <w:rFonts w:ascii="Calibri" w:hAnsi="Calibri" w:cs="Calibri"/>
-          <w:sz w:val="21"/>
-          <w:szCs w:val="21"/>
-        </w:rPr>
-        <w:t xml:space="preserve"> in high-security, multi-agency environments for international stakeholders</w:t>
-      </w:r>
-    </w:p>
-    <w:p>
-      <w:pPr>
-        <w:numPr>
-          <w:ilvl w:val="0"/>
-          <w:numId w:val="1"/>
-        </w:numPr>
-        <w:spacing w:before="0" w:after="0" w:line="214" w:lineRule="auto"/>
-        <w:ind w:left="360" w:hanging="216"/>
-      </w:pPr>
-      <w:r>
-        <w:rPr>
-          <w:rFonts w:ascii="Calibri" w:hAnsi="Calibri" w:cs="Calibri"/>
-          <w:sz w:val="21"/>
-          <w:szCs w:val="21"/>
-        </w:rPr>
-        <w:t xml:space="preserve">Translated </w:t>
-      </w:r>
-      <w:r>
-        <w:rPr>
-          <w:rFonts w:ascii="Calibri" w:hAnsi="Calibri" w:cs="Calibri"/>
-          <w:b/>
-          <w:bCs/>
-          <w:sz w:val="21"/>
-          <w:szCs w:val="21"/>
-        </w:rPr>
-        <w:t xml:space="preserve">sensitive documents and briefings</w:t>
-      </w:r>
-      <w:r>
-        <w:rPr>
-          <w:rFonts w:ascii="Calibri" w:hAnsi="Calibri" w:cs="Calibri"/>
-          <w:sz w:val="21"/>
-          <w:szCs w:val="21"/>
-        </w:rPr>
-        <w:t xml:space="preserve"> with precision, enabling coordination across government and defense teams</w:t>
+        <w:t xml:space="preserve">Provided real-time English–Korean interpretation in high-security, multi-agency environments for international stakeholders</w:t>
+      </w:r>
+    </w:p>
+    <w:p>
+      <w:pPr>
+        <w:numPr>
+          <w:ilvl w:val="0"/>
+          <w:numId w:val="1"/>
+        </w:numPr>
+        <w:spacing w:before="0" w:after="0" w:line="214" w:lineRule="auto"/>
+        <w:ind w:left="360" w:hanging="216"/>
+      </w:pPr>
+      <w:r>
+        <w:rPr>
+          <w:rFonts w:ascii="Calibri" w:hAnsi="Calibri" w:cs="Calibri"/>
+          <w:sz w:val="21"/>
+          <w:szCs w:val="21"/>
+        </w:rPr>
+        <w:t xml:space="preserve">Translated sensitive documents and briefings with precision, enabling coordination across government and defense teams</w:t>
       </w:r>
     </w:p>
     <w:p>
@@ -974,25 +848,7 @@
           <w:sz w:val="21"/>
           <w:szCs w:val="21"/>
         </w:rPr>
-        <w:t xml:space="preserve">Wrote and </w:t>
-      </w:r>
-      <w:r>
-        <w:rPr>
-          <w:rFonts w:ascii="Calibri" w:hAnsi="Calibri" w:cs="Calibri"/>
-          <w:b/>
-          <w:bCs/>
-          <w:sz w:val="21"/>
-          <w:szCs w:val="21"/>
-        </w:rPr>
-        <w:t xml:space="preserve">optimized SQL queries</w:t>
-      </w:r>
-      <w:r>
-        <w:rPr>
-          <w:rFonts w:ascii="Calibri" w:hAnsi="Calibri" w:cs="Calibri"/>
-          <w:sz w:val="21"/>
-          <w:szCs w:val="21"/>
-        </w:rPr>
-        <w:t xml:space="preserve"> to improve retrieval and management efficiency across large-scale datasets</w:t>
+        <w:t xml:space="preserve">Wrote and optimized SQL queries to improve retrieval and management efficiency across large-scale datasets</w:t>
       </w:r>
     </w:p>
     <w:p>
@@ -1030,7 +886,7 @@
           <w:sz w:val="21"/>
           <w:szCs w:val="21"/>
         </w:rPr>
-        <w:t xml:space="preserve">CareerOS</w:t>
+        <w:t xml:space="preserve">Capsule</w:t>
       </w:r>
       <w:r>
         <w:rPr>
@@ -1048,7 +904,7 @@
           <w:sz w:val="21"/>
           <w:szCs w:val="21"/>
         </w:rPr>
-        <w:t xml:space="preserve">TypeScript, Node.js, LLM/Agent tooling, Astro</w:t>
+        <w:t xml:space="preserve">React, Three.js (R3F), MongoDB, AWS S3</w:t>
       </w:r>
       <w:r>
         <w:rPr>
@@ -1059,133 +915,79 @@
           <w:szCs w:val="21"/>
         </w:rPr>
         <w:tab/>
-        <w:t xml:space="preserve">2026</w:t>
-      </w:r>
-    </w:p>
-    <w:p>
-      <w:pPr>
-        <w:numPr>
-          <w:ilvl w:val="0"/>
-          <w:numId w:val="1"/>
-        </w:numPr>
-        <w:spacing w:before="0" w:after="0" w:line="214" w:lineRule="auto"/>
-        <w:ind w:left="360" w:hanging="216"/>
-      </w:pPr>
-      <w:r>
-        <w:rPr>
-          <w:rFonts w:ascii="Calibri" w:hAnsi="Calibri" w:cs="Calibri"/>
-          <w:sz w:val="21"/>
-          <w:szCs w:val="21"/>
-        </w:rPr>
-        <w:t xml:space="preserve">Built an </w:t>
-      </w:r>
-      <w:r>
-        <w:rPr>
-          <w:rFonts w:ascii="Calibri" w:hAnsi="Calibri" w:cs="Calibri"/>
-          <w:b/>
-          <w:bCs/>
-          <w:sz w:val="21"/>
-          <w:szCs w:val="21"/>
-        </w:rPr>
-        <w:t xml:space="preserve">AI-assisted career platform</w:t>
-      </w:r>
-      <w:r>
-        <w:rPr>
-          <w:rFonts w:ascii="Calibri" w:hAnsi="Calibri" w:cs="Calibri"/>
-          <w:sz w:val="21"/>
-          <w:szCs w:val="21"/>
-        </w:rPr>
-        <w:t xml:space="preserve">: automated role sourcing across </w:t>
-      </w:r>
-      <w:r>
-        <w:rPr>
-          <w:rFonts w:ascii="Calibri" w:hAnsi="Calibri" w:cs="Calibri"/>
-          <w:b/>
-          <w:bCs/>
-          <w:sz w:val="21"/>
-          <w:szCs w:val="21"/>
-        </w:rPr>
-        <w:t xml:space="preserve">~110 ATS boards</w:t>
-      </w:r>
-      <w:r>
-        <w:rPr>
-          <w:rFonts w:ascii="Calibri" w:hAnsi="Calibri" w:cs="Calibri"/>
-          <w:sz w:val="21"/>
-          <w:szCs w:val="21"/>
-        </w:rPr>
-        <w:t xml:space="preserve"> surfacing 5,000+ live roles</w:t>
-      </w:r>
-    </w:p>
-    <w:p>
-      <w:pPr>
-        <w:numPr>
-          <w:ilvl w:val="0"/>
-          <w:numId w:val="1"/>
-        </w:numPr>
-        <w:spacing w:before="0" w:after="0" w:line="214" w:lineRule="auto"/>
-        <w:ind w:left="360" w:hanging="216"/>
-      </w:pPr>
-      <w:r>
-        <w:rPr>
-          <w:rFonts w:ascii="Calibri" w:hAnsi="Calibri" w:cs="Calibri"/>
-          <w:sz w:val="21"/>
-          <w:szCs w:val="21"/>
-        </w:rPr>
-        <w:t xml:space="preserve">Engineered deterministic fit-ranking and a </w:t>
-      </w:r>
-      <w:r>
-        <w:rPr>
-          <w:rFonts w:ascii="Calibri" w:hAnsi="Calibri" w:cs="Calibri"/>
-          <w:b/>
-          <w:bCs/>
-          <w:sz w:val="21"/>
-          <w:szCs w:val="21"/>
-        </w:rPr>
-        <w:t xml:space="preserve">cross-device application tracker</w:t>
-      </w:r>
-      <w:r>
-        <w:rPr>
-          <w:rFonts w:ascii="Calibri" w:hAnsi="Calibri" w:cs="Calibri"/>
-          <w:sz w:val="21"/>
-          <w:szCs w:val="21"/>
-        </w:rPr>
-        <w:t xml:space="preserve"> with live Google Sheet sync</w:t>
-      </w:r>
-    </w:p>
-    <w:p>
-      <w:pPr>
-        <w:numPr>
-          <w:ilvl w:val="0"/>
-          <w:numId w:val="1"/>
-        </w:numPr>
-        <w:spacing w:before="0" w:after="0" w:line="214" w:lineRule="auto"/>
-        <w:ind w:left="360" w:hanging="216"/>
-      </w:pPr>
-      <w:r>
-        <w:rPr>
-          <w:rFonts w:ascii="Calibri" w:hAnsi="Calibri" w:cs="Calibri"/>
-          <w:sz w:val="21"/>
-          <w:szCs w:val="21"/>
-        </w:rPr>
-        <w:t xml:space="preserve">Shipped an </w:t>
-      </w:r>
-      <w:r>
-        <w:rPr>
-          <w:rFonts w:ascii="Calibri" w:hAnsi="Calibri" w:cs="Calibri"/>
-          <w:b/>
-          <w:bCs/>
-          <w:sz w:val="21"/>
-          <w:szCs w:val="21"/>
-        </w:rPr>
-        <w:t xml:space="preserve">agentic morning-brief</w:t>
-      </w:r>
-      <w:r>
-        <w:rPr>
-          <w:rFonts w:ascii="Calibri" w:hAnsi="Calibri" w:cs="Calibri"/>
-          <w:sz w:val="21"/>
-          <w:szCs w:val="21"/>
-        </w:rPr>
-        <w:t xml:space="preserve"> and answer-drafting assistant — a personal career operating system</w:t>
+        <w:t xml:space="preserve">Jan 2025 – Apr 2025</w:t>
+      </w:r>
+    </w:p>
+    <w:p>
+      <w:pPr>
+        <w:numPr>
+          <w:ilvl w:val="0"/>
+          <w:numId w:val="1"/>
+        </w:numPr>
+        <w:spacing w:before="0" w:after="0" w:line="214" w:lineRule="auto"/>
+        <w:ind w:left="360" w:hanging="216"/>
+      </w:pPr>
+      <w:r>
+        <w:rPr>
+          <w:rFonts w:ascii="Calibri" w:hAnsi="Calibri" w:cs="Calibri"/>
+          <w:sz w:val="21"/>
+          <w:szCs w:val="21"/>
+        </w:rPr>
+        <w:t xml:space="preserve">Built a </w:t>
+      </w:r>
+      <w:r>
+        <w:rPr>
+          <w:rFonts w:ascii="Calibri" w:hAnsi="Calibri" w:cs="Calibri"/>
+          <w:b/>
+          <w:bCs/>
+          <w:sz w:val="21"/>
+          <w:szCs w:val="21"/>
+        </w:rPr>
+        <w:t xml:space="preserve">full-stack web app</w:t>
+      </w:r>
+      <w:r>
+        <w:rPr>
+          <w:rFonts w:ascii="Calibri" w:hAnsi="Calibri" w:cs="Calibri"/>
+          <w:sz w:val="21"/>
+          <w:szCs w:val="21"/>
+        </w:rPr>
+        <w:t xml:space="preserve"> (team of 4) for creating interactive 3D time capsules with media storage and timed unlocking</w:t>
+      </w:r>
+    </w:p>
+    <w:p>
+      <w:pPr>
+        <w:numPr>
+          <w:ilvl w:val="0"/>
+          <w:numId w:val="1"/>
+        </w:numPr>
+        <w:spacing w:before="0" w:after="0" w:line="214" w:lineRule="auto"/>
+        <w:ind w:left="360" w:hanging="216"/>
+      </w:pPr>
+      <w:r>
+        <w:rPr>
+          <w:rFonts w:ascii="Calibri" w:hAnsi="Calibri" w:cs="Calibri"/>
+          <w:sz w:val="21"/>
+          <w:szCs w:val="21"/>
+        </w:rPr>
+        <w:t xml:space="preserve">Engineered immersive 3D scenes with React Three Fiber for real-time rendering, animation, and direct-manipulation interaction</w:t>
+      </w:r>
+    </w:p>
+    <w:p>
+      <w:pPr>
+        <w:numPr>
+          <w:ilvl w:val="0"/>
+          <w:numId w:val="1"/>
+        </w:numPr>
+        <w:spacing w:before="0" w:after="0" w:line="214" w:lineRule="auto"/>
+        <w:ind w:left="360" w:hanging="216"/>
+      </w:pPr>
+      <w:r>
+        <w:rPr>
+          <w:rFonts w:ascii="Calibri" w:hAnsi="Calibri" w:cs="Calibri"/>
+          <w:sz w:val="21"/>
+          <w:szCs w:val="21"/>
+        </w:rPr>
+        <w:t xml:space="preserve">Designed the backend on MongoDB with scalable media storage on AWS S3, wiring authentication and timed-release logic</w:t>
       </w:r>
     </w:p>
     <w:p>
@@ -1358,7 +1160,7 @@
           <w:sz w:val="21"/>
           <w:szCs w:val="21"/>
         </w:rPr>
-        <w:t xml:space="preserve">Capsule</w:t>
+        <w:t xml:space="preserve">Mini Maya</w:t>
       </w:r>
       <w:r>
         <w:rPr>
@@ -1376,7 +1178,7 @@
           <w:sz w:val="21"/>
           <w:szCs w:val="21"/>
         </w:rPr>
-        <w:t xml:space="preserve">React, Three.js (R3F), MongoDB, AWS S3</w:t>
+        <w:t xml:space="preserve">C++, OpenGL, Qt</w:t>
       </w:r>
       <w:r>
         <w:rPr>
@@ -1387,133 +1189,79 @@
           <w:szCs w:val="21"/>
         </w:rPr>
         <w:tab/>
-        <w:t xml:space="preserve">Jan 2025 – Apr 2025</w:t>
-      </w:r>
-    </w:p>
-    <w:p>
-      <w:pPr>
-        <w:numPr>
-          <w:ilvl w:val="0"/>
-          <w:numId w:val="1"/>
-        </w:numPr>
-        <w:spacing w:before="0" w:after="0" w:line="214" w:lineRule="auto"/>
-        <w:ind w:left="360" w:hanging="216"/>
-      </w:pPr>
-      <w:r>
-        <w:rPr>
-          <w:rFonts w:ascii="Calibri" w:hAnsi="Calibri" w:cs="Calibri"/>
-          <w:sz w:val="21"/>
-          <w:szCs w:val="21"/>
-        </w:rPr>
-        <w:t xml:space="preserve">Built a </w:t>
-      </w:r>
-      <w:r>
-        <w:rPr>
-          <w:rFonts w:ascii="Calibri" w:hAnsi="Calibri" w:cs="Calibri"/>
-          <w:b/>
-          <w:bCs/>
-          <w:sz w:val="21"/>
-          <w:szCs w:val="21"/>
-        </w:rPr>
-        <w:t xml:space="preserve">full-stack web app</w:t>
-      </w:r>
-      <w:r>
-        <w:rPr>
-          <w:rFonts w:ascii="Calibri" w:hAnsi="Calibri" w:cs="Calibri"/>
-          <w:sz w:val="21"/>
-          <w:szCs w:val="21"/>
-        </w:rPr>
-        <w:t xml:space="preserve"> (team of 4) for creating interactive 3D time capsules with media storage and timed unlocking</w:t>
-      </w:r>
-    </w:p>
-    <w:p>
-      <w:pPr>
-        <w:numPr>
-          <w:ilvl w:val="0"/>
-          <w:numId w:val="1"/>
-        </w:numPr>
-        <w:spacing w:before="0" w:after="0" w:line="214" w:lineRule="auto"/>
-        <w:ind w:left="360" w:hanging="216"/>
-      </w:pPr>
-      <w:r>
-        <w:rPr>
-          <w:rFonts w:ascii="Calibri" w:hAnsi="Calibri" w:cs="Calibri"/>
-          <w:sz w:val="21"/>
-          <w:szCs w:val="21"/>
-        </w:rPr>
-        <w:t xml:space="preserve">Engineered immersive 3D scenes with </w:t>
-      </w:r>
-      <w:r>
-        <w:rPr>
-          <w:rFonts w:ascii="Calibri" w:hAnsi="Calibri" w:cs="Calibri"/>
-          <w:b/>
-          <w:bCs/>
-          <w:sz w:val="21"/>
-          <w:szCs w:val="21"/>
-        </w:rPr>
-        <w:t xml:space="preserve">React Three Fiber</w:t>
-      </w:r>
-      <w:r>
-        <w:rPr>
-          <w:rFonts w:ascii="Calibri" w:hAnsi="Calibri" w:cs="Calibri"/>
-          <w:sz w:val="21"/>
-          <w:szCs w:val="21"/>
-        </w:rPr>
-        <w:t xml:space="preserve"> for real-time rendering, animation, and direct-manipulation interaction</w:t>
-      </w:r>
-    </w:p>
-    <w:p>
-      <w:pPr>
-        <w:numPr>
-          <w:ilvl w:val="0"/>
-          <w:numId w:val="1"/>
-        </w:numPr>
-        <w:spacing w:before="0" w:after="0" w:line="214" w:lineRule="auto"/>
-        <w:ind w:left="360" w:hanging="216"/>
-      </w:pPr>
-      <w:r>
-        <w:rPr>
-          <w:rFonts w:ascii="Calibri" w:hAnsi="Calibri" w:cs="Calibri"/>
-          <w:sz w:val="21"/>
-          <w:szCs w:val="21"/>
-        </w:rPr>
-        <w:t xml:space="preserve">Designed the backend with </w:t>
-      </w:r>
-      <w:r>
-        <w:rPr>
-          <w:rFonts w:ascii="Calibri" w:hAnsi="Calibri" w:cs="Calibri"/>
-          <w:b/>
-          <w:bCs/>
-          <w:sz w:val="21"/>
-          <w:szCs w:val="21"/>
-        </w:rPr>
-        <w:t xml:space="preserve">MongoDB</w:t>
-      </w:r>
-      <w:r>
-        <w:rPr>
-          <w:rFonts w:ascii="Calibri" w:hAnsi="Calibri" w:cs="Calibri"/>
-          <w:sz w:val="21"/>
-          <w:szCs w:val="21"/>
-        </w:rPr>
-        <w:t xml:space="preserve"> and scalable media storage on </w:t>
-      </w:r>
-      <w:r>
-        <w:rPr>
-          <w:rFonts w:ascii="Calibri" w:hAnsi="Calibri" w:cs="Calibri"/>
-          <w:b/>
-          <w:bCs/>
-          <w:sz w:val="21"/>
-          <w:szCs w:val="21"/>
-        </w:rPr>
-        <w:t xml:space="preserve">AWS S3</w:t>
-      </w:r>
-      <w:r>
-        <w:rPr>
-          <w:rFonts w:ascii="Calibri" w:hAnsi="Calibri" w:cs="Calibri"/>
-          <w:sz w:val="21"/>
-          <w:szCs w:val="21"/>
-        </w:rPr>
-        <w:t xml:space="preserve">, wiring authentication and timed-release logic</w:t>
+        <w:t xml:space="preserve">Feb 2026 – Mar 2026</w:t>
+      </w:r>
+    </w:p>
+    <w:p>
+      <w:pPr>
+        <w:numPr>
+          <w:ilvl w:val="0"/>
+          <w:numId w:val="1"/>
+        </w:numPr>
+        <w:spacing w:before="0" w:after="0" w:line="214" w:lineRule="auto"/>
+        <w:ind w:left="360" w:hanging="216"/>
+      </w:pPr>
+      <w:r>
+        <w:rPr>
+          <w:rFonts w:ascii="Calibri" w:hAnsi="Calibri" w:cs="Calibri"/>
+          <w:sz w:val="21"/>
+          <w:szCs w:val="21"/>
+        </w:rPr>
+        <w:t xml:space="preserve">Implemented a </w:t>
+      </w:r>
+      <w:r>
+        <w:rPr>
+          <w:rFonts w:ascii="Calibri" w:hAnsi="Calibri" w:cs="Calibri"/>
+          <w:b/>
+          <w:bCs/>
+          <w:sz w:val="21"/>
+          <w:szCs w:val="21"/>
+        </w:rPr>
+        <w:t xml:space="preserve">half-edge mesh data structure</w:t>
+      </w:r>
+      <w:r>
+        <w:rPr>
+          <w:rFonts w:ascii="Calibri" w:hAnsi="Calibri" w:cs="Calibri"/>
+          <w:sz w:val="21"/>
+          <w:szCs w:val="21"/>
+        </w:rPr>
+        <w:t xml:space="preserve"> enabling efficient traversal and topology-aware editing operations</w:t>
+      </w:r>
+    </w:p>
+    <w:p>
+      <w:pPr>
+        <w:numPr>
+          <w:ilvl w:val="0"/>
+          <w:numId w:val="1"/>
+        </w:numPr>
+        <w:spacing w:before="0" w:after="0" w:line="214" w:lineRule="auto"/>
+        <w:ind w:left="360" w:hanging="216"/>
+      </w:pPr>
+      <w:r>
+        <w:rPr>
+          <w:rFonts w:ascii="Calibri" w:hAnsi="Calibri" w:cs="Calibri"/>
+          <w:sz w:val="21"/>
+          <w:szCs w:val="21"/>
+        </w:rPr>
+        <w:t xml:space="preserve">Built edge split, extrusion, and </w:t>
+      </w:r>
+      <w:r>
+        <w:rPr>
+          <w:rFonts w:ascii="Calibri" w:hAnsi="Calibri" w:cs="Calibri"/>
+          <w:b/>
+          <w:bCs/>
+          <w:sz w:val="21"/>
+          <w:szCs w:val="21"/>
+        </w:rPr>
+        <w:t xml:space="preserve">Catmull–Clark subdivision</w:t>
+      </w:r>
+      <w:r>
+        <w:rPr>
+          <w:rFonts w:ascii="Calibri" w:hAnsi="Calibri" w:cs="Calibri"/>
+          <w:sz w:val="21"/>
+          <w:szCs w:val="21"/>
+        </w:rPr>
+        <w:t xml:space="preserve"> on an OpenGL/VBO pipeline with GLSL shaders</w:t>
       </w:r>
     </w:p>
     <w:p>

</xml_diff>

<commit_message>
resume: fill the SWE page + fix the dangling 2.7x line
- SWE bottom whitespace cut 44pt→18pt: restored Mini Minecraft physics/collision
  bullet + added a Mini Maya interactive-editor bullet (fills SWE/Graphics/Game/AI
  via content, keeping the dense look — spacing couldn't loosen without overflow)
- win-back bullet now LEADS with the ~2.7x metric so the line no longer ends on a
  short dangling number
All 5 variants one page.

Co-Authored-By: Claude Opus 4.8 <noreply@anthropic.com>
</commit_message>
<xml_diff>
--- a/apps/resume/dist/Brian_Lee_Resume_AI.docx
+++ b/apps/resume/dist/Brian_Lee_Resume_AI.docx
@@ -1262,6 +1262,42 @@
           <w:szCs w:val="21"/>
         </w:rPr>
         <w:t xml:space="preserve"> on an OpenGL/VBO pipeline with GLSL shaders</w:t>
+      </w:r>
+    </w:p>
+    <w:p>
+      <w:pPr>
+        <w:numPr>
+          <w:ilvl w:val="0"/>
+          <w:numId w:val="1"/>
+        </w:numPr>
+        <w:spacing w:before="0" w:after="0" w:line="214" w:lineRule="auto"/>
+        <w:ind w:left="360" w:hanging="216"/>
+      </w:pPr>
+      <w:r>
+        <w:rPr>
+          <w:rFonts w:ascii="Calibri" w:hAnsi="Calibri" w:cs="Calibri"/>
+          <w:sz w:val="21"/>
+          <w:szCs w:val="21"/>
+        </w:rPr>
+        <w:t xml:space="preserve">Built an interactive </w:t>
+      </w:r>
+      <w:r>
+        <w:rPr>
+          <w:rFonts w:ascii="Calibri" w:hAnsi="Calibri" w:cs="Calibri"/>
+          <w:b/>
+          <w:bCs/>
+          <w:sz w:val="21"/>
+          <w:szCs w:val="21"/>
+        </w:rPr>
+        <w:t xml:space="preserve">Qt desktop editor</w:t>
+      </w:r>
+      <w:r>
+        <w:rPr>
+          <w:rFonts w:ascii="Calibri" w:hAnsi="Calibri" w:cs="Calibri"/>
+          <w:sz w:val="21"/>
+          <w:szCs w:val="21"/>
+        </w:rPr>
+        <w:t xml:space="preserve"> — vertex/edge/face selection, a GUI control panel, and a real-time OpenGL viewport</w:t>
       </w:r>
     </w:p>
     <w:p>

</xml_diff>

<commit_message>
resume: drop the overstated 'first ... paid subscription' claim
The win-back conversion was n=1 and first only for that feature, not the
company — not defensible as 'first'. Reframe the retention bullet around what
is unimpeachable: shipped the production system + instrumented the A/B to
recover lapsed users as paying subscribers. (both SWE/Graphics/Game and AI)

Co-Authored-By: Claude Opus 4.8 <noreply@anthropic.com>
</commit_message>
<xml_diff>
--- a/apps/resume/dist/Brian_Lee_Resume_AI.docx
+++ b/apps/resume/dist/Brian_Lee_Resume_AI.docx
@@ -356,17 +356,17 @@
           <w:sz w:val="21"/>
           <w:szCs w:val="21"/>
         </w:rPr>
-        <w:t xml:space="preserve">Shipped a production retention system (Supabase, Deno edge functions, FCM) with a treatment/holdout A/B that drove the product's </w:t>
-      </w:r>
-      <w:r>
-        <w:rPr>
-          <w:rFonts w:ascii="Calibri" w:hAnsi="Calibri" w:cs="Calibri"/>
-          <w:b/>
-          <w:bCs/>
-          <w:sz w:val="21"/>
-          <w:szCs w:val="21"/>
-        </w:rPr>
-        <w:t xml:space="preserve">first recovered paid subscription</w:t>
+        <w:t xml:space="preserve">Shipped a production retention system (Supabase, Deno edge functions, FCM) that re-engages lapsed users to recover them as paying subscribers, instrumented with a </w:t>
+      </w:r>
+      <w:r>
+        <w:rPr>
+          <w:rFonts w:ascii="Calibri" w:hAnsi="Calibri" w:cs="Calibri"/>
+          <w:b/>
+          <w:bCs/>
+          <w:sz w:val="21"/>
+          <w:szCs w:val="21"/>
+        </w:rPr>
+        <w:t xml:space="preserve">treatment/holdout A/B</w:t>
       </w:r>
     </w:p>
     <w:p>

</xml_diff>

<commit_message>
resume: Mini Minecraft = only Brian's work; retention definitive
- Mini Minecraft rewritten to ONLY Brian's credited contributions (procedural
  terrain/biomes, 3D caves + post-process, render pipeline). Removed the
  chunk-streaming/frustum-culling (Angelina) and player-physics/collision (Seth)
  bullets that were wrongly claimed. Team-of-3 noted.
- retention bullet now definitive per Brian: 'recovering churned users back into
  paying subscribers' (still no overstated 'first')
- trimmed a Mini Maya bullet to hold one page

Co-Authored-By: Claude Opus 4.8 <noreply@anthropic.com>
</commit_message>
<xml_diff>
--- a/apps/resume/dist/Brian_Lee_Resume_AI.docx
+++ b/apps/resume/dist/Brian_Lee_Resume_AI.docx
@@ -356,17 +356,17 @@
           <w:sz w:val="21"/>
           <w:szCs w:val="21"/>
         </w:rPr>
-        <w:t xml:space="preserve">Shipped a production retention system (Supabase, Deno edge functions, FCM) that re-engages lapsed users to recover them as paying subscribers, instrumented with a </w:t>
-      </w:r>
-      <w:r>
-        <w:rPr>
-          <w:rFonts w:ascii="Calibri" w:hAnsi="Calibri" w:cs="Calibri"/>
-          <w:b/>
-          <w:bCs/>
-          <w:sz w:val="21"/>
-          <w:szCs w:val="21"/>
-        </w:rPr>
-        <w:t xml:space="preserve">treatment/holdout A/B</w:t>
+        <w:t xml:space="preserve">Shipped a production retention system (Supabase, Deno edge functions, FCM) with a treatment/holdout A/B, </w:t>
+      </w:r>
+      <w:r>
+        <w:rPr>
+          <w:rFonts w:ascii="Calibri" w:hAnsi="Calibri" w:cs="Calibri"/>
+          <w:b/>
+          <w:bCs/>
+          <w:sz w:val="21"/>
+          <w:szCs w:val="21"/>
+        </w:rPr>
+        <w:t xml:space="preserve">recovering churned users back into paying subscribers</w:t>
       </w:r>
     </w:p>
     <w:p>
@@ -1052,97 +1052,97 @@
           <w:sz w:val="21"/>
           <w:szCs w:val="21"/>
         </w:rPr>
-        <w:t xml:space="preserve">Engineered a </w:t>
-      </w:r>
-      <w:r>
-        <w:rPr>
-          <w:rFonts w:ascii="Calibri" w:hAnsi="Calibri" w:cs="Calibri"/>
-          <w:b/>
-          <w:bCs/>
-          <w:sz w:val="21"/>
-          <w:szCs w:val="21"/>
-        </w:rPr>
-        <w:t xml:space="preserve">voxel engine from scratch</w:t>
-      </w:r>
-      <w:r>
-        <w:rPr>
-          <w:rFonts w:ascii="Calibri" w:hAnsi="Calibri" w:cs="Calibri"/>
-          <w:sz w:val="21"/>
-          <w:szCs w:val="21"/>
-        </w:rPr>
-        <w:t xml:space="preserve">: 7 procedural biomes from layered Perlin/FBM/Voronoi noise with smoothstep blending</w:t>
-      </w:r>
-    </w:p>
-    <w:p>
-      <w:pPr>
-        <w:numPr>
-          <w:ilvl w:val="0"/>
-          <w:numId w:val="1"/>
-        </w:numPr>
-        <w:spacing w:before="0" w:after="0" w:line="214" w:lineRule="auto"/>
-        <w:ind w:left="360" w:hanging="216"/>
-      </w:pPr>
-      <w:r>
-        <w:rPr>
-          <w:rFonts w:ascii="Calibri" w:hAnsi="Calibri" w:cs="Calibri"/>
-          <w:sz w:val="21"/>
-          <w:szCs w:val="21"/>
-        </w:rPr>
-        <w:t xml:space="preserve">Implemented </w:t>
-      </w:r>
-      <w:r>
-        <w:rPr>
-          <w:rFonts w:ascii="Calibri" w:hAnsi="Calibri" w:cs="Calibri"/>
-          <w:b/>
-          <w:bCs/>
-          <w:sz w:val="21"/>
-          <w:szCs w:val="21"/>
-        </w:rPr>
-        <w:t xml:space="preserve">3D Perlin cave systems</w:t>
-      </w:r>
-      <w:r>
-        <w:rPr>
-          <w:rFonts w:ascii="Calibri" w:hAnsi="Calibri" w:cs="Calibri"/>
-          <w:sz w:val="21"/>
-          <w:szCs w:val="21"/>
-        </w:rPr>
-        <w:t xml:space="preserve"> with trilinear interpolation, fluid physics, and post-process tint overlays</w:t>
-      </w:r>
-    </w:p>
-    <w:p>
-      <w:pPr>
-        <w:numPr>
-          <w:ilvl w:val="0"/>
-          <w:numId w:val="1"/>
-        </w:numPr>
-        <w:spacing w:before="0" w:after="0" w:line="214" w:lineRule="auto"/>
-        <w:ind w:left="360" w:hanging="216"/>
-      </w:pPr>
-      <w:r>
-        <w:rPr>
-          <w:rFonts w:ascii="Calibri" w:hAnsi="Calibri" w:cs="Calibri"/>
-          <w:sz w:val="21"/>
-          <w:szCs w:val="21"/>
-        </w:rPr>
-        <w:t xml:space="preserve">Built the render pipeline: </w:t>
-      </w:r>
-      <w:r>
-        <w:rPr>
-          <w:rFonts w:ascii="Calibri" w:hAnsi="Calibri" w:cs="Calibri"/>
-          <w:b/>
-          <w:bCs/>
-          <w:sz w:val="21"/>
-          <w:szCs w:val="21"/>
-        </w:rPr>
-        <w:t xml:space="preserve">7×7 PCF soft shadows, screen-space reflections, vertex AO</w:t>
-      </w:r>
-      <w:r>
-        <w:rPr>
-          <w:rFonts w:ascii="Calibri" w:hAnsi="Calibri" w:cs="Calibri"/>
-          <w:sz w:val="21"/>
-          <w:szCs w:val="21"/>
-        </w:rPr>
-        <w:t xml:space="preserve">, and a dynamic day-night cycle</w:t>
+        <w:t xml:space="preserve">Built </w:t>
+      </w:r>
+      <w:r>
+        <w:rPr>
+          <w:rFonts w:ascii="Calibri" w:hAnsi="Calibri" w:cs="Calibri"/>
+          <w:b/>
+          <w:bCs/>
+          <w:sz w:val="21"/>
+          <w:szCs w:val="21"/>
+        </w:rPr>
+        <w:t xml:space="preserve">7-biome procedural world generation</w:t>
+      </w:r>
+      <w:r>
+        <w:rPr>
+          <w:rFonts w:ascii="Calibri" w:hAnsi="Calibri" w:cs="Calibri"/>
+          <w:sz w:val="21"/>
+          <w:szCs w:val="21"/>
+        </w:rPr>
+        <w:t xml:space="preserve"> for a from-scratch voxel engine (team of 3) — layered Perlin/FBM/Voronoi noise with smoothstep blending</w:t>
+      </w:r>
+    </w:p>
+    <w:p>
+      <w:pPr>
+        <w:numPr>
+          <w:ilvl w:val="0"/>
+          <w:numId w:val="1"/>
+        </w:numPr>
+        <w:spacing w:before="0" w:after="0" w:line="214" w:lineRule="auto"/>
+        <w:ind w:left="360" w:hanging="216"/>
+      </w:pPr>
+      <w:r>
+        <w:rPr>
+          <w:rFonts w:ascii="Calibri" w:hAnsi="Calibri" w:cs="Calibri"/>
+          <w:sz w:val="21"/>
+          <w:szCs w:val="21"/>
+        </w:rPr>
+        <w:t xml:space="preserve">Carved </w:t>
+      </w:r>
+      <w:r>
+        <w:rPr>
+          <w:rFonts w:ascii="Calibri" w:hAnsi="Calibri" w:cs="Calibri"/>
+          <w:b/>
+          <w:bCs/>
+          <w:sz w:val="21"/>
+          <w:szCs w:val="21"/>
+        </w:rPr>
+        <w:t xml:space="preserve">3D Perlin-noise cave systems</w:t>
+      </w:r>
+      <w:r>
+        <w:rPr>
+          <w:rFonts w:ascii="Calibri" w:hAnsi="Calibri" w:cs="Calibri"/>
+          <w:sz w:val="21"/>
+          <w:szCs w:val="21"/>
+        </w:rPr>
+        <w:t xml:space="preserve"> and post-process water/lava overlays through a framebuffer pass</w:t>
+      </w:r>
+    </w:p>
+    <w:p>
+      <w:pPr>
+        <w:numPr>
+          <w:ilvl w:val="0"/>
+          <w:numId w:val="1"/>
+        </w:numPr>
+        <w:spacing w:before="0" w:after="0" w:line="214" w:lineRule="auto"/>
+        <w:ind w:left="360" w:hanging="216"/>
+      </w:pPr>
+      <w:r>
+        <w:rPr>
+          <w:rFonts w:ascii="Calibri" w:hAnsi="Calibri" w:cs="Calibri"/>
+          <w:sz w:val="21"/>
+          <w:szCs w:val="21"/>
+        </w:rPr>
+        <w:t xml:space="preserve">Engineered the GLSL </w:t>
+      </w:r>
+      <w:r>
+        <w:rPr>
+          <w:rFonts w:ascii="Calibri" w:hAnsi="Calibri" w:cs="Calibri"/>
+          <w:b/>
+          <w:bCs/>
+          <w:sz w:val="21"/>
+          <w:szCs w:val="21"/>
+        </w:rPr>
+        <w:t xml:space="preserve">render pipeline</w:t>
+      </w:r>
+      <w:r>
+        <w:rPr>
+          <w:rFonts w:ascii="Calibri" w:hAnsi="Calibri" w:cs="Calibri"/>
+          <w:sz w:val="21"/>
+          <w:szCs w:val="21"/>
+        </w:rPr>
+        <w:t xml:space="preserve"> — 7×7 PCF shadow mapping, screen-space reflections, vertex ambient occlusion, and a day-night cycle</w:t>
       </w:r>
     </w:p>
     <w:p>
@@ -1261,43 +1261,7 @@
           <w:sz w:val="21"/>
           <w:szCs w:val="21"/>
         </w:rPr>
-        <w:t xml:space="preserve"> on an OpenGL/VBO pipeline with GLSL shaders</w:t>
-      </w:r>
-    </w:p>
-    <w:p>
-      <w:pPr>
-        <w:numPr>
-          <w:ilvl w:val="0"/>
-          <w:numId w:val="1"/>
-        </w:numPr>
-        <w:spacing w:before="0" w:after="0" w:line="214" w:lineRule="auto"/>
-        <w:ind w:left="360" w:hanging="216"/>
-      </w:pPr>
-      <w:r>
-        <w:rPr>
-          <w:rFonts w:ascii="Calibri" w:hAnsi="Calibri" w:cs="Calibri"/>
-          <w:sz w:val="21"/>
-          <w:szCs w:val="21"/>
-        </w:rPr>
-        <w:t xml:space="preserve">Built an interactive </w:t>
-      </w:r>
-      <w:r>
-        <w:rPr>
-          <w:rFonts w:ascii="Calibri" w:hAnsi="Calibri" w:cs="Calibri"/>
-          <w:b/>
-          <w:bCs/>
-          <w:sz w:val="21"/>
-          <w:szCs w:val="21"/>
-        </w:rPr>
-        <w:t xml:space="preserve">Qt desktop editor</w:t>
-      </w:r>
-      <w:r>
-        <w:rPr>
-          <w:rFonts w:ascii="Calibri" w:hAnsi="Calibri" w:cs="Calibri"/>
-          <w:sz w:val="21"/>
-          <w:szCs w:val="21"/>
-        </w:rPr>
-        <w:t xml:space="preserve"> — vertex/edge/face selection, a GUI control panel, and a real-time OpenGL viewport</w:t>
+        <w:t xml:space="preserve">, with an interactive Qt desktop editor over an OpenGL viewport</w:t>
       </w:r>
     </w:p>
     <w:p>

</xml_diff>

<commit_message>
resume: accurate Capsule (3D gallery+design) & Mini Maya (DS/parser/subdivision); pack 4 variants
- Capsule reframed to Brian's actual part (3D gallery in R3F + front-end UI/design);
  dropped the backend/API claim (that was teammates')
- Mini Maya expanded to its real CS depth (half-edge data structure, OBJ parser,
  Catmull-Clark subdivision) — confirmed solo (CIS 4600 HW6/7)
- SWE order: Capsule -> Mini Maya -> Mini Minecraft (graphics last)
- SWE/Graphics/Game/AI packed to ~0.25in bottom margin

Co-Authored-By: Claude Opus 4.8 <noreply@anthropic.com>
</commit_message>
<xml_diff>
--- a/apps/resume/dist/Brian_Lee_Resume_AI.docx
+++ b/apps/resume/dist/Brian_Lee_Resume_AI.docx
@@ -904,7 +904,7 @@
           <w:sz w:val="21"/>
           <w:szCs w:val="21"/>
         </w:rPr>
-        <w:t xml:space="preserve">React, Three.js (R3F), MongoDB, AWS S3</w:t>
+        <w:t xml:space="preserve">React, Three.js (R3F), Blender</w:t>
       </w:r>
       <w:r>
         <w:rPr>
@@ -933,61 +933,61 @@
           <w:sz w:val="21"/>
           <w:szCs w:val="21"/>
         </w:rPr>
-        <w:t xml:space="preserve">Built a </w:t>
-      </w:r>
-      <w:r>
-        <w:rPr>
-          <w:rFonts w:ascii="Calibri" w:hAnsi="Calibri" w:cs="Calibri"/>
-          <w:b/>
-          <w:bCs/>
-          <w:sz w:val="21"/>
-          <w:szCs w:val="21"/>
-        </w:rPr>
-        <w:t xml:space="preserve">full-stack web app</w:t>
-      </w:r>
-      <w:r>
-        <w:rPr>
-          <w:rFonts w:ascii="Calibri" w:hAnsi="Calibri" w:cs="Calibri"/>
-          <w:sz w:val="21"/>
-          <w:szCs w:val="21"/>
-        </w:rPr>
-        <w:t xml:space="preserve"> (team of 4) for creating interactive 3D time capsules with media storage and timed unlocking</w:t>
-      </w:r>
-    </w:p>
-    <w:p>
-      <w:pPr>
-        <w:numPr>
-          <w:ilvl w:val="0"/>
-          <w:numId w:val="1"/>
-        </w:numPr>
-        <w:spacing w:before="0" w:after="0" w:line="214" w:lineRule="auto"/>
-        <w:ind w:left="360" w:hanging="216"/>
-      </w:pPr>
-      <w:r>
-        <w:rPr>
-          <w:rFonts w:ascii="Calibri" w:hAnsi="Calibri" w:cs="Calibri"/>
-          <w:sz w:val="21"/>
-          <w:szCs w:val="21"/>
-        </w:rPr>
-        <w:t xml:space="preserve">Engineered immersive 3D scenes with React Three Fiber for real-time rendering, animation, and direct-manipulation interaction</w:t>
-      </w:r>
-    </w:p>
-    <w:p>
-      <w:pPr>
-        <w:numPr>
-          <w:ilvl w:val="0"/>
-          <w:numId w:val="1"/>
-        </w:numPr>
-        <w:spacing w:before="0" w:after="0" w:line="214" w:lineRule="auto"/>
-        <w:ind w:left="360" w:hanging="216"/>
-      </w:pPr>
-      <w:r>
-        <w:rPr>
-          <w:rFonts w:ascii="Calibri" w:hAnsi="Calibri" w:cs="Calibri"/>
-          <w:sz w:val="21"/>
-          <w:szCs w:val="21"/>
-        </w:rPr>
-        <w:t xml:space="preserve">Designed the backend on MongoDB with scalable media storage on AWS S3, wiring authentication and timed-release logic</w:t>
+        <w:t xml:space="preserve">Built the </w:t>
+      </w:r>
+      <w:r>
+        <w:rPr>
+          <w:rFonts w:ascii="Calibri" w:hAnsi="Calibri" w:cs="Calibri"/>
+          <w:b/>
+          <w:bCs/>
+          <w:sz w:val="21"/>
+          <w:szCs w:val="21"/>
+        </w:rPr>
+        <w:t xml:space="preserve">interactive 3D gallery</w:t>
+      </w:r>
+      <w:r>
+        <w:rPr>
+          <w:rFonts w:ascii="Calibri" w:hAnsi="Calibri" w:cs="Calibri"/>
+          <w:sz w:val="21"/>
+          <w:szCs w:val="21"/>
+        </w:rPr>
+        <w:t xml:space="preserve"> in React Three Fiber for a collaborative time-capsule web app (team of 4) — real-time rendering, animation, and direct-manipulation placement of media in 3D</w:t>
+      </w:r>
+    </w:p>
+    <w:p>
+      <w:pPr>
+        <w:numPr>
+          <w:ilvl w:val="0"/>
+          <w:numId w:val="1"/>
+        </w:numPr>
+        <w:spacing w:before="0" w:after="0" w:line="214" w:lineRule="auto"/>
+        <w:ind w:left="360" w:hanging="216"/>
+      </w:pPr>
+      <w:r>
+        <w:rPr>
+          <w:rFonts w:ascii="Calibri" w:hAnsi="Calibri" w:cs="Calibri"/>
+          <w:sz w:val="21"/>
+          <w:szCs w:val="21"/>
+        </w:rPr>
+        <w:t xml:space="preserve">Owned the product's </w:t>
+      </w:r>
+      <w:r>
+        <w:rPr>
+          <w:rFonts w:ascii="Calibri" w:hAnsi="Calibri" w:cs="Calibri"/>
+          <w:b/>
+          <w:bCs/>
+          <w:sz w:val="21"/>
+          <w:szCs w:val="21"/>
+        </w:rPr>
+        <w:t xml:space="preserve">front-end UI and interaction design</w:t>
+      </w:r>
+      <w:r>
+        <w:rPr>
+          <w:rFonts w:ascii="Calibri" w:hAnsi="Calibri" w:cs="Calibri"/>
+          <w:sz w:val="21"/>
+          <w:szCs w:val="21"/>
+        </w:rPr>
+        <w:t xml:space="preserve"> across the create → contribute → unlock flow</w:t>
       </w:r>
     </w:p>
     <w:p>
@@ -1070,7 +1070,7 @@
           <w:sz w:val="21"/>
           <w:szCs w:val="21"/>
         </w:rPr>
-        <w:t xml:space="preserve"> for a from-scratch voxel engine (team of 3) — layered Perlin/FBM/Voronoi noise with smoothstep blending</w:t>
+        <w:t xml:space="preserve"> for a from-scratch voxel engine (team of 3) — Perlin/FBM/Voronoi noise with smoothstep blending</w:t>
       </w:r>
     </w:p>
     <w:p>
@@ -1098,15 +1098,15 @@
           <w:sz w:val="21"/>
           <w:szCs w:val="21"/>
         </w:rPr>
-        <w:t xml:space="preserve">3D Perlin-noise cave systems</w:t>
-      </w:r>
-      <w:r>
-        <w:rPr>
-          <w:rFonts w:ascii="Calibri" w:hAnsi="Calibri" w:cs="Calibri"/>
-          <w:sz w:val="21"/>
-          <w:szCs w:val="21"/>
-        </w:rPr>
-        <w:t xml:space="preserve"> and post-process water/lava overlays through a framebuffer pass</w:t>
+        <w:t xml:space="preserve">3D Perlin-noise caves</w:t>
+      </w:r>
+      <w:r>
+        <w:rPr>
+          <w:rFonts w:ascii="Calibri" w:hAnsi="Calibri" w:cs="Calibri"/>
+          <w:sz w:val="21"/>
+          <w:szCs w:val="21"/>
+        </w:rPr>
+        <w:t xml:space="preserve"> and post-process water/lava overlays via a framebuffer pass</w:t>
       </w:r>
     </w:p>
     <w:p>
@@ -1142,7 +1142,7 @@
           <w:sz w:val="21"/>
           <w:szCs w:val="21"/>
         </w:rPr>
-        <w:t xml:space="preserve"> — 7×7 PCF shadow mapping, screen-space reflections, vertex ambient occlusion, and a day-night cycle</w:t>
+        <w:t xml:space="preserve"> — PCF shadow mapping, screen-space reflections, vertex AO, and a day-night cycle</w:t>
       </w:r>
     </w:p>
     <w:p>
@@ -1225,25 +1225,61 @@
           <w:sz w:val="21"/>
           <w:szCs w:val="21"/>
         </w:rPr>
-        <w:t xml:space="preserve"> enabling efficient traversal and topology-aware editing operations</w:t>
-      </w:r>
-    </w:p>
-    <w:p>
-      <w:pPr>
-        <w:numPr>
-          <w:ilvl w:val="0"/>
-          <w:numId w:val="1"/>
-        </w:numPr>
-        <w:spacing w:before="0" w:after="0" w:line="214" w:lineRule="auto"/>
-        <w:ind w:left="360" w:hanging="216"/>
-      </w:pPr>
-      <w:r>
-        <w:rPr>
-          <w:rFonts w:ascii="Calibri" w:hAnsi="Calibri" w:cs="Calibri"/>
-          <w:sz w:val="21"/>
-          <w:szCs w:val="21"/>
-        </w:rPr>
-        <w:t xml:space="preserve">Built edge split, extrusion, and </w:t>
+        <w:t xml:space="preserve"> (Face/HalfEdge/Vertex, smart-pointer ownership) for topology-aware traversal and editing</w:t>
+      </w:r>
+    </w:p>
+    <w:p>
+      <w:pPr>
+        <w:numPr>
+          <w:ilvl w:val="0"/>
+          <w:numId w:val="1"/>
+        </w:numPr>
+        <w:spacing w:before="0" w:after="0" w:line="214" w:lineRule="auto"/>
+        <w:ind w:left="360" w:hanging="216"/>
+      </w:pPr>
+      <w:r>
+        <w:rPr>
+          <w:rFonts w:ascii="Calibri" w:hAnsi="Calibri" w:cs="Calibri"/>
+          <w:sz w:val="21"/>
+          <w:szCs w:val="21"/>
+        </w:rPr>
+        <w:t xml:space="preserve">Wrote an </w:t>
+      </w:r>
+      <w:r>
+        <w:rPr>
+          <w:rFonts w:ascii="Calibri" w:hAnsi="Calibri" w:cs="Calibri"/>
+          <w:b/>
+          <w:bCs/>
+          <w:sz w:val="21"/>
+          <w:szCs w:val="21"/>
+        </w:rPr>
+        <w:t xml:space="preserve">OBJ parser</w:t>
+      </w:r>
+      <w:r>
+        <w:rPr>
+          <w:rFonts w:ascii="Calibri" w:hAnsi="Calibri" w:cs="Calibri"/>
+          <w:sz w:val="21"/>
+          <w:szCs w:val="21"/>
+        </w:rPr>
+        <w:t xml:space="preserve"> that builds the mesh from arbitrary n-gon inputs, rendered via OpenGL VBOs</w:t>
+      </w:r>
+    </w:p>
+    <w:p>
+      <w:pPr>
+        <w:numPr>
+          <w:ilvl w:val="0"/>
+          <w:numId w:val="1"/>
+        </w:numPr>
+        <w:spacing w:before="0" w:after="0" w:line="214" w:lineRule="auto"/>
+        <w:ind w:left="360" w:hanging="216"/>
+      </w:pPr>
+      <w:r>
+        <w:rPr>
+          <w:rFonts w:ascii="Calibri" w:hAnsi="Calibri" w:cs="Calibri"/>
+          <w:sz w:val="21"/>
+          <w:szCs w:val="21"/>
+        </w:rPr>
+        <w:t xml:space="preserve">Implemented </w:t>
       </w:r>
       <w:r>
         <w:rPr>
@@ -1261,7 +1297,7 @@
           <w:sz w:val="21"/>
           <w:szCs w:val="21"/>
         </w:rPr>
-        <w:t xml:space="preserve">, with an interactive Qt desktop editor over an OpenGL viewport</w:t>
+        <w:t xml:space="preserve"> and topology ops (split, extrusion, triangulation) in a Qt editor</w:t>
       </w:r>
     </w:p>
     <w:p>

</xml_diff>

<commit_message>
resume: rebalance the engineering experience section around Aleph
Aleph had grown to six of twelve experience bullets, so the section read as one
internship with footnotes. It is back to four of twelve — the same share it held
before — and all five roles are listed again rather than three.

No wording changed. Every surviving bullet is verbatim; the section was rebalanced
purely by which bullets appear. Aleph keeps the zero-user release, the untestable
population, the autonomous retention channel and the notification-injection fix;
the flag-rollback and failed-request bullets come out, since the first two already
carry the rollout story. The interpreter role returns as one line and Penn Spark
as two, which is what the longer prevention-framed Aleph bullets leave room for.

Co-Authored-By: Claude Opus 5 <noreply@anthropic.com>
</commit_message>
<xml_diff>
--- a/apps/resume/dist/Brian_Lee_Resume_AI.docx
+++ b/apps/resume/dist/Brian_Lee_Resume_AI.docx
@@ -653,6 +653,99 @@
           <w:szCs w:val="21"/>
         </w:rPr>
         <w:t xml:space="preserve"> designers and developers</w:t>
+      </w:r>
+    </w:p>
+    <w:p>
+      <w:pPr>
+        <w:numPr>
+          <w:ilvl w:val="0"/>
+          <w:numId w:val="1"/>
+        </w:numPr>
+        <w:spacing w:before="0" w:after="0" w:line="214" w:lineRule="auto"/>
+        <w:ind w:left="360" w:hanging="216"/>
+      </w:pPr>
+      <w:r>
+        <w:rPr>
+          <w:rFonts w:ascii="Calibri" w:hAnsi="Calibri" w:cs="Calibri"/>
+          <w:b/>
+          <w:bCs/>
+          <w:sz w:val="21"/>
+          <w:szCs w:val="21"/>
+        </w:rPr>
+        <w:t xml:space="preserve">Made design decisions once instead of per-person</w:t>
+      </w:r>
+      <w:r>
+        <w:rPr>
+          <w:rFonts w:ascii="Calibri" w:hAnsi="Calibri" w:cs="Calibri"/>
+          <w:sz w:val="21"/>
+          <w:szCs w:val="21"/>
+        </w:rPr>
+        <w:t xml:space="preserve">, defining the end-to-end flows and reusable interface systems the team built inside</w:t>
+      </w:r>
+    </w:p>
+    <w:p>
+      <w:pPr>
+        <w:tabs>
+          <w:tab w:val="right" w:pos="10944"/>
+        </w:tabs>
+        <w:spacing w:before="100" w:after="0" w:line="214" w:lineRule="auto"/>
+      </w:pPr>
+      <w:r>
+        <w:rPr>
+          <w:rFonts w:ascii="Calibri" w:hAnsi="Calibri" w:cs="Calibri"/>
+          <w:b/>
+          <w:bCs/>
+          <w:sz w:val="21"/>
+          <w:szCs w:val="21"/>
+        </w:rPr>
+        <w:t xml:space="preserve">Military Interpreter</w:t>
+      </w:r>
+      <w:r>
+        <w:rPr>
+          <w:rFonts w:ascii="Calibri" w:hAnsi="Calibri" w:cs="Calibri"/>
+          <w:sz w:val="21"/>
+          <w:szCs w:val="21"/>
+        </w:rPr>
+        <w:t xml:space="preserve">, Capital Defense Command (ROK Army)</w:t>
+      </w:r>
+      <w:r>
+        <w:rPr>
+          <w:rFonts w:ascii="Calibri" w:hAnsi="Calibri" w:cs="Calibri"/>
+          <w:i/>
+          <w:iCs/>
+          <w:sz w:val="20"/>
+          <w:szCs w:val="20"/>
+        </w:rPr>
+        <w:tab/>
+        <w:t xml:space="preserve">Dec 2022 – June 2024  ·  Seoul, South Korea</w:t>
+      </w:r>
+    </w:p>
+    <w:p>
+      <w:pPr>
+        <w:numPr>
+          <w:ilvl w:val="0"/>
+          <w:numId w:val="1"/>
+        </w:numPr>
+        <w:spacing w:before="0" w:after="0" w:line="214" w:lineRule="auto"/>
+        <w:ind w:left="360" w:hanging="216"/>
+      </w:pPr>
+      <w:r>
+        <w:rPr>
+          <w:rFonts w:ascii="Calibri" w:hAnsi="Calibri" w:cs="Calibri"/>
+          <w:b/>
+          <w:bCs/>
+          <w:sz w:val="21"/>
+          <w:szCs w:val="21"/>
+        </w:rPr>
+        <w:t xml:space="preserve">Held coordination together across government and defense organizations</w:t>
+      </w:r>
+      <w:r>
+        <w:rPr>
+          <w:rFonts w:ascii="Calibri" w:hAnsi="Calibri" w:cs="Calibri"/>
+          <w:sz w:val="21"/>
+          <w:szCs w:val="21"/>
+        </w:rPr>
+        <w:t xml:space="preserve"> as real-time English–Korean interpreter in high-security, multi-agency settings</w:t>
       </w:r>
     </w:p>
     <w:p>

</xml_diff>

<commit_message>
resume: name the Aleph stack, and put agentic coding in Skills
Adds a one-line Stack under the Aleph entry, angled per variant — Minecraft
modding and Kotlin lead on Game, Figma MCP and design tokens on Design, the
Agent SDK on AI — and puts Claude Code, Codex, the Claude Agent SDK and MCP
into the skills line of every variant, since that is where a recruiter greps.

Two things deliberately left off the stack list. NativeWind, because the 07-14
decision log records it being removed as unused dead weight, so claiming it
invites a question with no good answer. And the libraries that appear in the
monorepo manifest but not in any of his tickets — ElevenLabs, Azure scoring,
CallKeep, Playwright, Stripe, the analytics SDKs.

Paid for with BitMango's weakest bullet. All five variants still one page.

Co-Authored-By: Claude Opus 5 <noreply@anthropic.com>
</commit_message>
<xml_diff>
--- a/apps/resume/dist/Brian_Lee_Resume_AI.docx
+++ b/apps/resume/dist/Brian_Lee_Resume_AI.docx
@@ -453,6 +453,31 @@
     </w:p>
     <w:p>
       <w:pPr>
+        <w:spacing w:before="40" w:after="0" w:line="214" w:lineRule="auto"/>
+      </w:pPr>
+      <w:r>
+        <w:rPr>
+          <w:rFonts w:ascii="Calibri" w:hAnsi="Calibri" w:cs="Calibri"/>
+          <w:b/>
+          <w:bCs/>
+          <w:sz w:val="19"/>
+          <w:szCs w:val="19"/>
+        </w:rPr>
+        <w:t xml:space="preserve">Stack: </w:t>
+      </w:r>
+      <w:r>
+        <w:rPr>
+          <w:rFonts w:ascii="Calibri" w:hAnsi="Calibri" w:cs="Calibri"/>
+          <w:i/>
+          <w:iCs/>
+          <w:sz w:val="19"/>
+          <w:szCs w:val="19"/>
+        </w:rPr>
+        <w:t xml:space="preserve">Claude Agent SDK · MCP servers (built and consumed) · Python · TypeScript · React Native (Expo) · Supabase/Postgres · GCP · Docker · PostHog · Sentry</w:t>
+      </w:r>
+    </w:p>
+    <w:p>
+      <w:pPr>
         <w:tabs>
           <w:tab w:val="right" w:pos="10944"/>
         </w:tabs>
@@ -546,34 +571,6 @@
     </w:p>
     <w:p>
       <w:pPr>
-        <w:numPr>
-          <w:ilvl w:val="0"/>
-          <w:numId w:val="1"/>
-        </w:numPr>
-        <w:spacing w:before="0" w:after="0" w:line="214" w:lineRule="auto"/>
-        <w:ind w:left="360" w:hanging="216"/>
-      </w:pPr>
-      <w:r>
-        <w:rPr>
-          <w:rFonts w:ascii="Calibri" w:hAnsi="Calibri" w:cs="Calibri"/>
-          <w:b/>
-          <w:bCs/>
-          <w:sz w:val="21"/>
-          <w:szCs w:val="21"/>
-        </w:rPr>
-        <w:t xml:space="preserve">Kept the portfolio compliant and in the stores</w:t>
-      </w:r>
-      <w:r>
-        <w:rPr>
-          <w:rFonts w:ascii="Calibri" w:hAnsi="Calibri" w:cs="Calibri"/>
-          <w:sz w:val="21"/>
-          <w:szCs w:val="21"/>
-        </w:rPr>
-        <w:t xml:space="preserve"> through a platform requirement change, upgrading SDKs fleet-wide</w:t>
-      </w:r>
-    </w:p>
-    <w:p>
-      <w:pPr>
         <w:tabs>
           <w:tab w:val="right" w:pos="10944"/>
         </w:tabs>
@@ -1318,7 +1315,7 @@
           <w:sz w:val="20"/>
           <w:szCs w:val="20"/>
         </w:rPr>
-        <w:t xml:space="preserve">Claude Agent SDK, MCP, LLM APIs (Anthropic/Gemini), agent orchestration, prompt engineering</w:t>
+        <w:t xml:space="preserve">Claude Agent SDK, MCP, Claude Code, Codex, LLM APIs (Anthropic/Gemini), agent orchestration, agentic coding</w:t>
       </w:r>
     </w:p>
     <w:p>

</xml_diff>

<commit_message>
resume: correct authorship of the notification system, and surface the Annie SDK
Brian flagged that the retention bullet read as though the system already
existed and he only automated it. The final report says otherwise: version one
— win-back, recency stages, per-stage copy, measurement holdout, anti-nag
back-off, streak reminders, class-completion alerts — was his build, with
auto-send deliberately deferred to v2, which he then also built. Resume and work
page both now say built, then made autonomous.

The Annie external-builder SDK was missing from every engineering variant
despite being the strongest pure-engineering item in the logs: versioned typed
APIs, per-session isolation, capability enforcement the creator cannot cross,
136 tests, and an outside builder shipping a game mode with no repository
access. It replaces the second of two notification bullets, which are now one.

Co-Authored-By: Claude Opus 5 <noreply@anthropic.com>
</commit_message>
<xml_diff>
--- a/apps/resume/dist/Brian_Lee_Resume_AI.docx
+++ b/apps/resume/dist/Brian_Lee_Resume_AI.docx
@@ -422,15 +422,15 @@
           <w:sz w:val="21"/>
           <w:szCs w:val="21"/>
         </w:rPr>
-        <w:t xml:space="preserve">Automated a push-notification retention system that had required manual approval for every send</w:t>
-      </w:r>
-      <w:r>
-        <w:rPr>
-          <w:rFonts w:ascii="Calibri" w:hAnsi="Calibri" w:cs="Calibri"/>
-          <w:sz w:val="21"/>
-          <w:szCs w:val="21"/>
-        </w:rPr>
-        <w:t xml:space="preserve">, delivering unattended at </w:t>
+        <w:t xml:space="preserve">Built the company's lifecycle notification system, then made it autonomous</w:t>
+      </w:r>
+      <w:r>
+        <w:rPr>
+          <w:rFonts w:ascii="Calibri" w:hAnsi="Calibri" w:cs="Calibri"/>
+          <w:sz w:val="21"/>
+          <w:szCs w:val="21"/>
+        </w:rPr>
+        <w:t xml:space="preserve"> — it proposes sends, clears its own safety guardrails and delivers unattended at </w:t>
       </w:r>
       <w:r>
         <w:rPr>
@@ -448,7 +448,7 @@
           <w:sz w:val="21"/>
           <w:szCs w:val="21"/>
         </w:rPr>
-        <w:t xml:space="preserve"> and producing its first paid conversion</w:t>
+        <w:t xml:space="preserve">, producing its first paid conversion</w:t>
       </w:r>
     </w:p>
     <w:p>

</xml_diff>

<commit_message>
resume: put scale into the project bullets, and measure the page instead of guessing
Projects now carry the verified numbers that were sitting unused in the site
data — the 13-shader GLSL pipeline on Mini Minecraft, the Node/MongoDB API
behind Capsule — which is what the guidance for project sections actually asks
for: treat them like experience entries, with scope and outcome, and never a
number you did not measure.

Switched the fit check from character estimates to Word's own layout: per
paragraph line counts for orphan detection, and the vertical position of the
last paragraph for page fill. Every variant now ends 12pt above the bottom
margin (AI 23pt) with no bullet leaving under 30 characters on its final line.

Co-Authored-By: Claude Opus 5 <noreply@anthropic.com>
</commit_message>
<xml_diff>
--- a/apps/resume/dist/Brian_Lee_Resume_AI.docx
+++ b/apps/resume/dist/Brian_Lee_Resume_AI.docx
@@ -374,7 +374,7 @@
           <w:sz w:val="21"/>
           <w:szCs w:val="21"/>
         </w:rPr>
-        <w:t xml:space="preserve"> that mined production data through read-only MCP — showing a reported retention gain was a measurement artifact</w:t>
+        <w:t xml:space="preserve"> that mined production data through read-only MCP — it showed a reported retention gain was a measurement artifact rather than a real effect, and surfaced the churn drivers that actually mattered</w:t>
       </w:r>
     </w:p>
     <w:p>
@@ -1053,7 +1053,25 @@
           <w:sz w:val="21"/>
           <w:szCs w:val="21"/>
         </w:rPr>
-        <w:t xml:space="preserve"> — the GLSL pipeline I owned: PCF shadows, screen-space reflections, vertex AO, day-night cycle</w:t>
+        <w:t xml:space="preserve"> — the </w:t>
+      </w:r>
+      <w:r>
+        <w:rPr>
+          <w:rFonts w:ascii="Calibri" w:hAnsi="Calibri" w:cs="Calibri"/>
+          <w:b/>
+          <w:bCs/>
+          <w:sz w:val="21"/>
+          <w:szCs w:val="21"/>
+        </w:rPr>
+        <w:t xml:space="preserve">13-shader</w:t>
+      </w:r>
+      <w:r>
+        <w:rPr>
+          <w:rFonts w:ascii="Calibri" w:hAnsi="Calibri" w:cs="Calibri"/>
+          <w:sz w:val="21"/>
+          <w:szCs w:val="21"/>
+        </w:rPr>
+        <w:t xml:space="preserve"> GLSL pipeline I owned: PCF shadow mapping, screen-space reflections, vertex AO, a day-night cycle and post-process water through a framebuffer pass</w:t>
       </w:r>
     </w:p>
     <w:p>
@@ -1313,7 +1331,7 @@
           <w:sz w:val="21"/>
           <w:szCs w:val="21"/>
         </w:rPr>
-        <w:t xml:space="preserve"> across the create → contribute → unlock flow</w:t>
+        <w:t xml:space="preserve"> across the create → contribute → unlock flow, over a Node/MongoDB API</w:t>
       </w:r>
     </w:p>
     <w:p>

</xml_diff>

<commit_message>
content: add the work on improving the agent itself, not just packaging it
My last pass found how the agent was shipped and missed how it was made better.
The behaviour work is now in: its defensive targeting picked by hostility flag
alone, which swept in provoke-only neutrals, a friendly mob and lethal bosses, so
it started encounters far above a child's level. The fix was deliberately
additive — it can only remove a bad target, never add an attack. Also its
perception of modded content, so a mode's custom blocks and items are recognised
rather than described with the wrong words.

Additive on both surfaces. On the resume it folds into the existing child-safety
bullet on the engineering variants and the agent bullet on AI, since a fifth
Aleph bullet does not fit; no existing claim was replaced. All five variants
still one page, all now at 12pt slack with no short trailing lines.

Co-Authored-By: Claude Opus 5 <noreply@anthropic.com>
</commit_message>
<xml_diff>
--- a/apps/resume/dist/Brian_Lee_Resume_AI.docx
+++ b/apps/resume/dist/Brian_Lee_Resume_AI.docx
@@ -310,7 +310,7 @@
           <w:sz w:val="21"/>
           <w:szCs w:val="21"/>
         </w:rPr>
-        <w:t xml:space="preserve">, published as npm packages over a hosted multi-tenant service, proven inside a game mode an </w:t>
+        <w:t xml:space="preserve">, published over a hosted multi-tenant service and proven inside a game mode an </w:t>
       </w:r>
       <w:r>
         <w:rPr>
@@ -321,6 +321,14 @@
           <w:szCs w:val="21"/>
         </w:rPr>
         <w:t xml:space="preserve">external builder authored</w:t>
+      </w:r>
+      <w:r>
+        <w:rPr>
+          <w:rFonts w:ascii="Calibri" w:hAnsi="Calibri" w:cs="Calibri"/>
+          <w:sz w:val="21"/>
+          <w:szCs w:val="21"/>
+        </w:rPr>
+        <w:t xml:space="preserve"> — then tuned its in-world behaviour so it stopped provoking encounters too hard for children</w:t>
       </w:r>
     </w:p>
     <w:p>

</xml_diff>

<commit_message>
resume: refresh all five variants
Capsule claims the design work (one of four designers, Blender and Spline,
team of eight) and SWE and AI close on CareerOS. BitMango carries its public
scale — 50+ live titles, a 420M+ download portfolio — with fixes framed as
QA and player reports acted on. Bullets reshaped around collaboration and
results, jargon translated to plain recruiter English, and short trailing
lines packed with verified substance: 28 bullets ended under 55% of the line
width before, 8 after, none under 46%. Every variant measures one page, full
at 722.5-734pt, zero orphans. The Graphics variant is now published for the
graphics view to serve.
</commit_message>
<xml_diff>
--- a/apps/resume/dist/Brian_Lee_Resume_AI.docx
+++ b/apps/resume/dist/Brian_Lee_Resume_AI.docx
@@ -29,7 +29,7 @@
           <w:sz w:val="20"/>
           <w:szCs w:val="20"/>
         </w:rPr>
-        <w:t xml:space="preserve">Philadelphia, PA | 215-294-7152 | leebwj@sas.upenn.edu | </w:t>
+        <w:t xml:space="preserve">Philadelphia, PA | US &amp; Korea dual citizen | 215-294-7152 | leebwj@sas.upenn.edu | </w:t>
       </w:r>
       <w:hyperlink r:id="rH1">
         <w:r>
@@ -189,7 +189,7 @@
           <w:sz w:val="20"/>
           <w:szCs w:val="20"/>
         </w:rPr>
-        <w:t xml:space="preserve">Interactive Computer Graphics, Computer Animation, 3-D Computer Modeling, Introduction to Algorithms, Introduction to Computer Systems, Programming Languages &amp; Techniques</w:t>
+        <w:t xml:space="preserve">Introduction to Algorithms, Introduction to Computer Systems, Automata, Computability &amp; Complexity, Programming Languages &amp; Techniques, Interactive Computer Graphics, Computer Animation, 3-D Computer Modeling</w:t>
       </w:r>
     </w:p>
     <w:p>
@@ -503,79 +503,97 @@
           <w:sz w:val="21"/>
           <w:szCs w:val="21"/>
         </w:rPr>
-        <w:t xml:space="preserve">Maintained a live portfolio of </w:t>
-      </w:r>
-      <w:r>
-        <w:rPr>
-          <w:rFonts w:ascii="Calibri" w:hAnsi="Calibri" w:cs="Calibri"/>
-          <w:b/>
-          <w:bCs/>
-          <w:sz w:val="21"/>
-          <w:szCs w:val="21"/>
-        </w:rPr>
-        <w:t xml:space="preserve">50+ Unity mobile game titles</w:t>
-      </w:r>
-      <w:r>
-        <w:rPr>
-          <w:rFonts w:ascii="Calibri" w:hAnsi="Calibri" w:cs="Calibri"/>
-          <w:sz w:val="21"/>
-          <w:szCs w:val="21"/>
-        </w:rPr>
-        <w:t xml:space="preserve">, improving UI/UX and core gameplay stability across releases</w:t>
-      </w:r>
-    </w:p>
-    <w:p>
-      <w:pPr>
-        <w:numPr>
-          <w:ilvl w:val="0"/>
-          <w:numId w:val="1"/>
-        </w:numPr>
-        <w:spacing w:before="0" w:after="0" w:line="214" w:lineRule="auto"/>
-        <w:ind w:left="360" w:hanging="216"/>
-      </w:pPr>
-      <w:r>
-        <w:rPr>
-          <w:rFonts w:ascii="Calibri" w:hAnsi="Calibri" w:cs="Calibri"/>
-          <w:sz w:val="21"/>
-          <w:szCs w:val="21"/>
-        </w:rPr>
-        <w:t xml:space="preserve">Resolved </w:t>
-      </w:r>
-      <w:r>
-        <w:rPr>
-          <w:rFonts w:ascii="Calibri" w:hAnsi="Calibri" w:cs="Calibri"/>
-          <w:b/>
-          <w:bCs/>
-          <w:sz w:val="21"/>
-          <w:szCs w:val="21"/>
-        </w:rPr>
-        <w:t xml:space="preserve">100+ QA-reported bugs</w:t>
-      </w:r>
-      <w:r>
-        <w:rPr>
-          <w:rFonts w:ascii="Calibri" w:hAnsi="Calibri" w:cs="Calibri"/>
-          <w:sz w:val="21"/>
-          <w:szCs w:val="21"/>
-        </w:rPr>
-        <w:t xml:space="preserve"> by modifying Unity prefabs and C# scripts, shipping fixes in production releases</w:t>
-      </w:r>
-    </w:p>
-    <w:p>
-      <w:pPr>
-        <w:numPr>
-          <w:ilvl w:val="0"/>
-          <w:numId w:val="1"/>
-        </w:numPr>
-        <w:spacing w:before="0" w:after="0" w:line="214" w:lineRule="auto"/>
-        <w:ind w:left="360" w:hanging="216"/>
-      </w:pPr>
-      <w:r>
-        <w:rPr>
-          <w:rFonts w:ascii="Calibri" w:hAnsi="Calibri" w:cs="Calibri"/>
-          <w:sz w:val="21"/>
-          <w:szCs w:val="21"/>
-        </w:rPr>
-        <w:t xml:space="preserve">Upgraded SDKs and platform modules fleet-wide to meet app-store requirements and sustain availability</w:t>
+        <w:t xml:space="preserve">Improved UI/UX and core gameplay stability across </w:t>
+      </w:r>
+      <w:r>
+        <w:rPr>
+          <w:rFonts w:ascii="Calibri" w:hAnsi="Calibri" w:cs="Calibri"/>
+          <w:b/>
+          <w:bCs/>
+          <w:sz w:val="21"/>
+          <w:szCs w:val="21"/>
+        </w:rPr>
+        <w:t xml:space="preserve">50+ live Unity titles</w:t>
+      </w:r>
+      <w:r>
+        <w:rPr>
+          <w:rFonts w:ascii="Calibri" w:hAnsi="Calibri" w:cs="Calibri"/>
+          <w:sz w:val="21"/>
+          <w:szCs w:val="21"/>
+        </w:rPr>
+        <w:t xml:space="preserve"> in a </w:t>
+      </w:r>
+      <w:r>
+        <w:rPr>
+          <w:rFonts w:ascii="Calibri" w:hAnsi="Calibri" w:cs="Calibri"/>
+          <w:b/>
+          <w:bCs/>
+          <w:sz w:val="21"/>
+          <w:szCs w:val="21"/>
+        </w:rPr>
+        <w:t xml:space="preserve">420M+ download</w:t>
+      </w:r>
+      <w:r>
+        <w:rPr>
+          <w:rFonts w:ascii="Calibri" w:hAnsi="Calibri" w:cs="Calibri"/>
+          <w:sz w:val="21"/>
+          <w:szCs w:val="21"/>
+        </w:rPr>
+        <w:t xml:space="preserve"> portfolio</w:t>
+      </w:r>
+    </w:p>
+    <w:p>
+      <w:pPr>
+        <w:numPr>
+          <w:ilvl w:val="0"/>
+          <w:numId w:val="1"/>
+        </w:numPr>
+        <w:spacing w:before="0" w:after="0" w:line="214" w:lineRule="auto"/>
+        <w:ind w:left="360" w:hanging="216"/>
+      </w:pPr>
+      <w:r>
+        <w:rPr>
+          <w:rFonts w:ascii="Calibri" w:hAnsi="Calibri" w:cs="Calibri"/>
+          <w:sz w:val="21"/>
+          <w:szCs w:val="21"/>
+        </w:rPr>
+        <w:t xml:space="preserve">Shipped fixes for </w:t>
+      </w:r>
+      <w:r>
+        <w:rPr>
+          <w:rFonts w:ascii="Calibri" w:hAnsi="Calibri" w:cs="Calibri"/>
+          <w:b/>
+          <w:bCs/>
+          <w:sz w:val="21"/>
+          <w:szCs w:val="21"/>
+        </w:rPr>
+        <w:t xml:space="preserve">100+ bugs</w:t>
+      </w:r>
+      <w:r>
+        <w:rPr>
+          <w:rFonts w:ascii="Calibri" w:hAnsi="Calibri" w:cs="Calibri"/>
+          <w:sz w:val="21"/>
+          <w:szCs w:val="21"/>
+        </w:rPr>
+        <w:t xml:space="preserve"> raised by QA and player reports, correcting Unity prefabs and C# scripts in production</w:t>
+      </w:r>
+    </w:p>
+    <w:p>
+      <w:pPr>
+        <w:numPr>
+          <w:ilvl w:val="0"/>
+          <w:numId w:val="1"/>
+        </w:numPr>
+        <w:spacing w:before="0" w:after="0" w:line="214" w:lineRule="auto"/>
+        <w:ind w:left="360" w:hanging="216"/>
+      </w:pPr>
+      <w:r>
+        <w:rPr>
+          <w:rFonts w:ascii="Calibri" w:hAnsi="Calibri" w:cs="Calibri"/>
+          <w:sz w:val="21"/>
+          <w:szCs w:val="21"/>
+        </w:rPr>
+        <w:t xml:space="preserve">Kept all 50+ titles live on the app stores by upgrading SDKs and platform modules as requirements changed</w:t>
       </w:r>
     </w:p>
     <w:p>
@@ -630,7 +648,7 @@
           <w:sz w:val="21"/>
           <w:szCs w:val="21"/>
         </w:rPr>
-        <w:t xml:space="preserve">Led a cross-functional team of </w:t>
+        <w:t xml:space="preserve">Led a team of </w:t>
       </w:r>
       <w:r>
         <w:rPr>
@@ -648,53 +666,25 @@
           <w:sz w:val="21"/>
           <w:szCs w:val="21"/>
         </w:rPr>
-        <w:t xml:space="preserve"> designers and developers to ship client-facing </w:t>
-      </w:r>
-      <w:r>
-        <w:rPr>
-          <w:rFonts w:ascii="Calibri" w:hAnsi="Calibri" w:cs="Calibri"/>
-          <w:b/>
-          <w:bCs/>
-          <w:sz w:val="21"/>
-          <w:szCs w:val="21"/>
-        </w:rPr>
-        <w:t xml:space="preserve">0-to-1 products</w:t>
-      </w:r>
-    </w:p>
-    <w:p>
-      <w:pPr>
-        <w:numPr>
-          <w:ilvl w:val="0"/>
-          <w:numId w:val="1"/>
-        </w:numPr>
-        <w:spacing w:before="0" w:after="0" w:line="214" w:lineRule="auto"/>
-        <w:ind w:left="360" w:hanging="216"/>
-      </w:pPr>
-      <w:r>
-        <w:rPr>
-          <w:rFonts w:ascii="Calibri" w:hAnsi="Calibri" w:cs="Calibri"/>
-          <w:sz w:val="21"/>
-          <w:szCs w:val="21"/>
-        </w:rPr>
-        <w:t xml:space="preserve">Defined end-to-end user flows, interaction patterns, and reusable interface systems across multiple deliverables</w:t>
-      </w:r>
-    </w:p>
-    <w:p>
-      <w:pPr>
-        <w:numPr>
-          <w:ilvl w:val="0"/>
-          <w:numId w:val="1"/>
-        </w:numPr>
-        <w:spacing w:before="0" w:after="0" w:line="214" w:lineRule="auto"/>
-        <w:ind w:left="360" w:hanging="216"/>
-      </w:pPr>
-      <w:r>
-        <w:rPr>
-          <w:rFonts w:ascii="Calibri" w:hAnsi="Calibri" w:cs="Calibri"/>
-          <w:sz w:val="21"/>
-          <w:szCs w:val="21"/>
-        </w:rPr>
-        <w:t xml:space="preserve">Shipped polished, user-centered features across semester-long client project cycles</w:t>
+        <w:t xml:space="preserve"> designers and developers shipping new products for real clients, from first concept to launch</w:t>
+      </w:r>
+    </w:p>
+    <w:p>
+      <w:pPr>
+        <w:numPr>
+          <w:ilvl w:val="0"/>
+          <w:numId w:val="1"/>
+        </w:numPr>
+        <w:spacing w:before="0" w:after="0" w:line="214" w:lineRule="auto"/>
+        <w:ind w:left="360" w:hanging="216"/>
+      </w:pPr>
+      <w:r>
+        <w:rPr>
+          <w:rFonts w:ascii="Calibri" w:hAnsi="Calibri" w:cs="Calibri"/>
+          <w:sz w:val="21"/>
+          <w:szCs w:val="21"/>
+        </w:rPr>
+        <w:t xml:space="preserve">Defined the end-to-end user flows and reusable interface systems the team shipped across multiple client deliverables</w:t>
       </w:r>
     </w:p>
     <w:p>
@@ -767,7 +757,7 @@
           <w:sz w:val="21"/>
           <w:szCs w:val="21"/>
         </w:rPr>
-        <w:t xml:space="preserve">Translated sensitive documents and briefings with precision, enabling coordination across government and defense teams</w:t>
+        <w:t xml:space="preserve">Translated sensitive documents and briefings, enabling coordination across government and defense teams</w:t>
       </w:r>
     </w:p>
     <w:p>
@@ -881,24 +871,6 @@
     </w:p>
     <w:p>
       <w:pPr>
-        <w:numPr>
-          <w:ilvl w:val="0"/>
-          <w:numId w:val="1"/>
-        </w:numPr>
-        <w:spacing w:before="0" w:after="0" w:line="214" w:lineRule="auto"/>
-        <w:ind w:left="360" w:hanging="216"/>
-      </w:pPr>
-      <w:r>
-        <w:rPr>
-          <w:rFonts w:ascii="Calibri" w:hAnsi="Calibri" w:cs="Calibri"/>
-          <w:sz w:val="21"/>
-          <w:szCs w:val="21"/>
-        </w:rPr>
-        <w:t xml:space="preserve">Wrote and optimized SQL queries to improve retrieval and management efficiency across large-scale datasets</w:t>
-      </w:r>
-    </w:p>
-    <w:p>
-      <w:pPr>
         <w:pBdr>
           <w:bottom w:val="single" w:sz="6" w:space="1" w:color="000000"/>
         </w:pBdr>
@@ -981,7 +953,53 @@
           <w:sz w:val="21"/>
           <w:szCs w:val="21"/>
         </w:rPr>
-        <w:t xml:space="preserve">Made a from-scratch voxel world read as varied rather than noisy</w:t>
+        <w:t xml:space="preserve">A Minecraft-style 3D game engine written from scratch in C++ and OpenGL</w:t>
+      </w:r>
+      <w:r>
+        <w:rPr>
+          <w:rFonts w:ascii="Calibri" w:hAnsi="Calibri" w:cs="Calibri"/>
+          <w:sz w:val="21"/>
+          <w:szCs w:val="21"/>
+        </w:rPr>
+        <w:t xml:space="preserve"> (team of 3) — I owned the world generation: </w:t>
+      </w:r>
+      <w:r>
+        <w:rPr>
+          <w:rFonts w:ascii="Calibri" w:hAnsi="Calibri" w:cs="Calibri"/>
+          <w:b/>
+          <w:bCs/>
+          <w:sz w:val="21"/>
+          <w:szCs w:val="21"/>
+        </w:rPr>
+        <w:t xml:space="preserve">7 procedural biomes</w:t>
+      </w:r>
+      <w:r>
+        <w:rPr>
+          <w:rFonts w:ascii="Calibri" w:hAnsi="Calibri" w:cs="Calibri"/>
+          <w:sz w:val="21"/>
+          <w:szCs w:val="21"/>
+        </w:rPr>
+        <w:t xml:space="preserve"> blended from layered noise, and caves generated as you explore</w:t>
+      </w:r>
+    </w:p>
+    <w:p>
+      <w:pPr>
+        <w:numPr>
+          <w:ilvl w:val="0"/>
+          <w:numId w:val="1"/>
+        </w:numPr>
+        <w:spacing w:before="0" w:after="0" w:line="214" w:lineRule="auto"/>
+        <w:ind w:left="360" w:hanging="216"/>
+      </w:pPr>
+      <w:r>
+        <w:rPr>
+          <w:rFonts w:ascii="Calibri" w:hAnsi="Calibri" w:cs="Calibri"/>
+          <w:b/>
+          <w:bCs/>
+          <w:sz w:val="21"/>
+          <w:szCs w:val="21"/>
+        </w:rPr>
+        <w:t xml:space="preserve">Owned the rendering pipeline that makes the world look real</w:t>
       </w:r>
       <w:r>
         <w:rPr>
@@ -999,79 +1017,15 @@
           <w:sz w:val="21"/>
           <w:szCs w:val="21"/>
         </w:rPr>
-        <w:t xml:space="preserve">7-biome procedural generation</w:t>
-      </w:r>
-      <w:r>
-        <w:rPr>
-          <w:rFonts w:ascii="Calibri" w:hAnsi="Calibri" w:cs="Calibri"/>
-          <w:sz w:val="21"/>
-          <w:szCs w:val="21"/>
-        </w:rPr>
-        <w:t xml:space="preserve"> (Perlin/FBM/Voronoi, smoothstep-blended) and </w:t>
-      </w:r>
-      <w:r>
-        <w:rPr>
-          <w:rFonts w:ascii="Calibri" w:hAnsi="Calibri" w:cs="Calibri"/>
-          <w:b/>
-          <w:bCs/>
-          <w:sz w:val="21"/>
-          <w:szCs w:val="21"/>
-        </w:rPr>
-        <w:t xml:space="preserve">3D Perlin caves</w:t>
-      </w:r>
-      <w:r>
-        <w:rPr>
-          <w:rFonts w:ascii="Calibri" w:hAnsi="Calibri" w:cs="Calibri"/>
-          <w:sz w:val="21"/>
-          <w:szCs w:val="21"/>
-        </w:rPr>
-        <w:t xml:space="preserve"> in a C++/OpenGL engine (team of 3)</w:t>
-      </w:r>
-    </w:p>
-    <w:p>
-      <w:pPr>
-        <w:numPr>
-          <w:ilvl w:val="0"/>
-          <w:numId w:val="1"/>
-        </w:numPr>
-        <w:spacing w:before="0" w:after="0" w:line="214" w:lineRule="auto"/>
-        <w:ind w:left="360" w:hanging="216"/>
-      </w:pPr>
-      <w:r>
-        <w:rPr>
-          <w:rFonts w:ascii="Calibri" w:hAnsi="Calibri" w:cs="Calibri"/>
-          <w:b/>
-          <w:bCs/>
-          <w:sz w:val="21"/>
-          <w:szCs w:val="21"/>
-        </w:rPr>
-        <w:t xml:space="preserve">Made that world legible</w:t>
-      </w:r>
-      <w:r>
-        <w:rPr>
-          <w:rFonts w:ascii="Calibri" w:hAnsi="Calibri" w:cs="Calibri"/>
-          <w:sz w:val="21"/>
-          <w:szCs w:val="21"/>
-        </w:rPr>
-        <w:t xml:space="preserve"> — the </w:t>
-      </w:r>
-      <w:r>
-        <w:rPr>
-          <w:rFonts w:ascii="Calibri" w:hAnsi="Calibri" w:cs="Calibri"/>
-          <w:b/>
-          <w:bCs/>
-          <w:sz w:val="21"/>
-          <w:szCs w:val="21"/>
-        </w:rPr>
-        <w:t xml:space="preserve">13-shader</w:t>
-      </w:r>
-      <w:r>
-        <w:rPr>
-          <w:rFonts w:ascii="Calibri" w:hAnsi="Calibri" w:cs="Calibri"/>
-          <w:sz w:val="21"/>
-          <w:szCs w:val="21"/>
-        </w:rPr>
-        <w:t xml:space="preserve"> GLSL pipeline I owned: 7×7 PCF shadow mapping, screen-space reflections, vertex AO, a day-night cycle and post-process water through a framebuffer pass</w:t>
+        <w:t xml:space="preserve">13 GLSL shaders</w:t>
+      </w:r>
+      <w:r>
+        <w:rPr>
+          <w:rFonts w:ascii="Calibri" w:hAnsi="Calibri" w:cs="Calibri"/>
+          <w:sz w:val="21"/>
+          <w:szCs w:val="21"/>
+        </w:rPr>
+        <w:t xml:space="preserve"> for shadows, reflective water, ambient shading and a day-night cycle, plus post-process overlays for underwater and lava</w:t>
       </w:r>
     </w:p>
     <w:p>
@@ -1138,79 +1092,43 @@
           <w:sz w:val="21"/>
           <w:szCs w:val="21"/>
         </w:rPr>
-        <w:t xml:space="preserve">Made arbitrary meshes editable in place</w:t>
-      </w:r>
-      <w:r>
-        <w:rPr>
-          <w:rFonts w:ascii="Calibri" w:hAnsi="Calibri" w:cs="Calibri"/>
-          <w:sz w:val="21"/>
-          <w:szCs w:val="21"/>
-        </w:rPr>
-        <w:t xml:space="preserve"> — a </w:t>
-      </w:r>
-      <w:r>
-        <w:rPr>
-          <w:rFonts w:ascii="Calibri" w:hAnsi="Calibri" w:cs="Calibri"/>
-          <w:b/>
-          <w:bCs/>
-          <w:sz w:val="21"/>
-          <w:szCs w:val="21"/>
-        </w:rPr>
-        <w:t xml:space="preserve">half-edge structure</w:t>
-      </w:r>
-      <w:r>
-        <w:rPr>
-          <w:rFonts w:ascii="Calibri" w:hAnsi="Calibri" w:cs="Calibri"/>
-          <w:sz w:val="21"/>
-          <w:szCs w:val="21"/>
-        </w:rPr>
-        <w:t xml:space="preserve"> with smart-pointer ownership giving topology-aware traversal, plus an OBJ parser accepting arbitrary n-gons, rendered via OpenGL VBOs</w:t>
-      </w:r>
-    </w:p>
-    <w:p>
-      <w:pPr>
-        <w:numPr>
-          <w:ilvl w:val="0"/>
-          <w:numId w:val="1"/>
-        </w:numPr>
-        <w:spacing w:before="0" w:after="0" w:line="214" w:lineRule="auto"/>
-        <w:ind w:left="360" w:hanging="216"/>
-      </w:pPr>
-      <w:r>
-        <w:rPr>
-          <w:rFonts w:ascii="Calibri" w:hAnsi="Calibri" w:cs="Calibri"/>
-          <w:b/>
-          <w:bCs/>
-          <w:sz w:val="21"/>
-          <w:szCs w:val="21"/>
-        </w:rPr>
-        <w:t xml:space="preserve">Turned coarse geometry into smooth surfaces</w:t>
-      </w:r>
-      <w:r>
-        <w:rPr>
-          <w:rFonts w:ascii="Calibri" w:hAnsi="Calibri" w:cs="Calibri"/>
-          <w:sz w:val="21"/>
-          <w:szCs w:val="21"/>
-        </w:rPr>
-        <w:t xml:space="preserve"> with </w:t>
-      </w:r>
-      <w:r>
-        <w:rPr>
-          <w:rFonts w:ascii="Calibri" w:hAnsi="Calibri" w:cs="Calibri"/>
-          <w:b/>
-          <w:bCs/>
-          <w:sz w:val="21"/>
-          <w:szCs w:val="21"/>
-        </w:rPr>
-        <w:t xml:space="preserve">Catmull–Clark subdivision</w:t>
-      </w:r>
-      <w:r>
-        <w:rPr>
-          <w:rFonts w:ascii="Calibri" w:hAnsi="Calibri" w:cs="Calibri"/>
-          <w:sz w:val="21"/>
-          <w:szCs w:val="21"/>
-        </w:rPr>
-        <w:t xml:space="preserve"> and topology ops in a Qt editor</w:t>
+        <w:t xml:space="preserve">A 3D modeling tool in the spirit of Maya, in C++ and Qt</w:t>
+      </w:r>
+      <w:r>
+        <w:rPr>
+          <w:rFonts w:ascii="Calibri" w:hAnsi="Calibri" w:cs="Calibri"/>
+          <w:sz w:val="21"/>
+          <w:szCs w:val="21"/>
+        </w:rPr>
+        <w:t xml:space="preserve"> — edit any model's geometry directly, with a half-edge structure tracking how faces, edges and vertices connect, each selectable from a clickable Qt list</w:t>
+      </w:r>
+    </w:p>
+    <w:p>
+      <w:pPr>
+        <w:numPr>
+          <w:ilvl w:val="0"/>
+          <w:numId w:val="1"/>
+        </w:numPr>
+        <w:spacing w:before="0" w:after="0" w:line="214" w:lineRule="auto"/>
+        <w:ind w:left="360" w:hanging="216"/>
+      </w:pPr>
+      <w:r>
+        <w:rPr>
+          <w:rFonts w:ascii="Calibri" w:hAnsi="Calibri" w:cs="Calibri"/>
+          <w:b/>
+          <w:bCs/>
+          <w:sz w:val="21"/>
+          <w:szCs w:val="21"/>
+        </w:rPr>
+        <w:t xml:space="preserve">Smooths rough models into refined surfaces</w:t>
+      </w:r>
+      <w:r>
+        <w:rPr>
+          <w:rFonts w:ascii="Calibri" w:hAnsi="Calibri" w:cs="Calibri"/>
+          <w:sz w:val="21"/>
+          <w:szCs w:val="21"/>
+        </w:rPr>
+        <w:t xml:space="preserve"> with Catmull–Clark subdivision, the algorithm film and game studios use</w:t>
       </w:r>
     </w:p>
     <w:p>
@@ -1228,7 +1146,7 @@
           <w:sz w:val="21"/>
           <w:szCs w:val="21"/>
         </w:rPr>
-        <w:t xml:space="preserve">Capsule</w:t>
+        <w:t xml:space="preserve">CareerOS</w:t>
       </w:r>
       <w:r>
         <w:rPr>
@@ -1246,7 +1164,7 @@
           <w:sz w:val="21"/>
           <w:szCs w:val="21"/>
         </w:rPr>
-        <w:t xml:space="preserve">React, Three.js (R3F), Blender</w:t>
+        <w:t xml:space="preserve">Node.js, TypeScript, GitHub Actions</w:t>
       </w:r>
       <w:r>
         <w:rPr>
@@ -1257,81 +1175,99 @@
           <w:szCs w:val="21"/>
         </w:rPr>
         <w:tab/>
-        <w:t xml:space="preserve">Jan 2025 – Apr 2025</w:t>
-      </w:r>
-    </w:p>
-    <w:p>
-      <w:pPr>
-        <w:numPr>
-          <w:ilvl w:val="0"/>
-          <w:numId w:val="1"/>
-        </w:numPr>
-        <w:spacing w:before="0" w:after="0" w:line="214" w:lineRule="auto"/>
-        <w:ind w:left="360" w:hanging="216"/>
-      </w:pPr>
-      <w:r>
-        <w:rPr>
-          <w:rFonts w:ascii="Calibri" w:hAnsi="Calibri" w:cs="Calibri"/>
-          <w:b/>
-          <w:bCs/>
-          <w:sz w:val="21"/>
-          <w:szCs w:val="21"/>
-        </w:rPr>
-        <w:t xml:space="preserve">Made memories something you walk through rather than scroll</w:t>
-      </w:r>
-      <w:r>
-        <w:rPr>
-          <w:rFonts w:ascii="Calibri" w:hAnsi="Calibri" w:cs="Calibri"/>
-          <w:sz w:val="21"/>
-          <w:szCs w:val="21"/>
-        </w:rPr>
-        <w:t xml:space="preserve"> — the </w:t>
-      </w:r>
-      <w:r>
-        <w:rPr>
-          <w:rFonts w:ascii="Calibri" w:hAnsi="Calibri" w:cs="Calibri"/>
-          <w:b/>
-          <w:bCs/>
-          <w:sz w:val="21"/>
-          <w:szCs w:val="21"/>
-        </w:rPr>
-        <w:t xml:space="preserve">3D gallery</w:t>
-      </w:r>
-      <w:r>
-        <w:rPr>
-          <w:rFonts w:ascii="Calibri" w:hAnsi="Calibri" w:cs="Calibri"/>
-          <w:sz w:val="21"/>
-          <w:szCs w:val="21"/>
-        </w:rPr>
-        <w:t xml:space="preserve"> in React Three Fiber for a collaborative time-capsule app (team of 4), with direct-manipulation placement of media</w:t>
-      </w:r>
-    </w:p>
-    <w:p>
-      <w:pPr>
-        <w:numPr>
-          <w:ilvl w:val="0"/>
-          <w:numId w:val="1"/>
-        </w:numPr>
-        <w:spacing w:before="0" w:after="0" w:line="214" w:lineRule="auto"/>
-        <w:ind w:left="360" w:hanging="216"/>
-      </w:pPr>
-      <w:r>
-        <w:rPr>
-          <w:rFonts w:ascii="Calibri" w:hAnsi="Calibri" w:cs="Calibri"/>
-          <w:b/>
-          <w:bCs/>
-          <w:sz w:val="21"/>
-          <w:szCs w:val="21"/>
-        </w:rPr>
-        <w:t xml:space="preserve">Owned how the product felt to use</w:t>
-      </w:r>
-      <w:r>
-        <w:rPr>
-          <w:rFonts w:ascii="Calibri" w:hAnsi="Calibri" w:cs="Calibri"/>
-          <w:sz w:val="21"/>
-          <w:szCs w:val="21"/>
-        </w:rPr>
-        <w:t xml:space="preserve"> across the create → contribute → unlock flow, over a Node/MongoDB API</w:t>
+        <w:t xml:space="preserve">May 2026</w:t>
+      </w:r>
+    </w:p>
+    <w:p>
+      <w:pPr>
+        <w:numPr>
+          <w:ilvl w:val="0"/>
+          <w:numId w:val="1"/>
+        </w:numPr>
+        <w:spacing w:before="0" w:after="0" w:line="214" w:lineRule="auto"/>
+        <w:ind w:left="360" w:hanging="216"/>
+      </w:pPr>
+      <w:r>
+        <w:rPr>
+          <w:rFonts w:ascii="Calibri" w:hAnsi="Calibri" w:cs="Calibri"/>
+          <w:b/>
+          <w:bCs/>
+          <w:sz w:val="21"/>
+          <w:szCs w:val="21"/>
+        </w:rPr>
+        <w:t xml:space="preserve">A job-search platform I built for myself and run daily</w:t>
+      </w:r>
+      <w:r>
+        <w:rPr>
+          <w:rFonts w:ascii="Calibri" w:hAnsi="Calibri" w:cs="Calibri"/>
+          <w:sz w:val="21"/>
+          <w:szCs w:val="21"/>
+        </w:rPr>
+        <w:t xml:space="preserve"> — it checks </w:t>
+      </w:r>
+      <w:r>
+        <w:rPr>
+          <w:rFonts w:ascii="Calibri" w:hAnsi="Calibri" w:cs="Calibri"/>
+          <w:b/>
+          <w:bCs/>
+          <w:sz w:val="21"/>
+          <w:szCs w:val="21"/>
+        </w:rPr>
+        <w:t xml:space="preserve">191 company career sites</w:t>
+      </w:r>
+      <w:r>
+        <w:rPr>
+          <w:rFonts w:ascii="Calibri" w:hAnsi="Calibri" w:cs="Calibri"/>
+          <w:sz w:val="21"/>
+          <w:szCs w:val="21"/>
+        </w:rPr>
+        <w:t xml:space="preserve"> every six hours and ranks </w:t>
+      </w:r>
+      <w:r>
+        <w:rPr>
+          <w:rFonts w:ascii="Calibri" w:hAnsi="Calibri" w:cs="Calibri"/>
+          <w:b/>
+          <w:bCs/>
+          <w:sz w:val="21"/>
+          <w:szCs w:val="21"/>
+        </w:rPr>
+        <w:t xml:space="preserve">11,000+ open roles</w:t>
+      </w:r>
+      <w:r>
+        <w:rPr>
+          <w:rFonts w:ascii="Calibri" w:hAnsi="Calibri" w:cs="Calibri"/>
+          <w:sz w:val="21"/>
+          <w:szCs w:val="21"/>
+        </w:rPr>
+        <w:t xml:space="preserve"> down to the few worth reading, sorted by how well each fits what I am looking for</w:t>
+      </w:r>
+    </w:p>
+    <w:p>
+      <w:pPr>
+        <w:numPr>
+          <w:ilvl w:val="0"/>
+          <w:numId w:val="1"/>
+        </w:numPr>
+        <w:spacing w:before="0" w:after="0" w:line="214" w:lineRule="auto"/>
+        <w:ind w:left="360" w:hanging="216"/>
+      </w:pPr>
+      <w:r>
+        <w:rPr>
+          <w:rFonts w:ascii="Calibri" w:hAnsi="Calibri" w:cs="Calibri"/>
+          <w:b/>
+          <w:bCs/>
+          <w:sz w:val="21"/>
+          <w:szCs w:val="21"/>
+        </w:rPr>
+        <w:t xml:space="preserve">Runs unattended without losing jobs quietly</w:t>
+      </w:r>
+      <w:r>
+        <w:rPr>
+          <w:rFonts w:ascii="Calibri" w:hAnsi="Calibri" w:cs="Calibri"/>
+          <w:sz w:val="21"/>
+          <w:szCs w:val="21"/>
+        </w:rPr>
+        <w:t xml:space="preserve"> — a site that breaks or returns nothing is flagged, not silently dropped, and a daily check re-scans every site into a tracker I read each morning</w:t>
       </w:r>
     </w:p>
     <w:p>

</xml_diff>